<commit_message>
Section 5.2: two approved wording edits; reorder not adopted
Narrower-test paragraph keeps its opening sentence and takes the shorter
sentences; age-check paragraph returns to its original wording. Order
and the other paragraphs unchanged. Numbers, citations and tables
unchanged (script check). Both reading copies rebuilt.

Co-Authored-By: Claude Sonnet 5.5 <noreply@anthropic.com>
Claude-Session: https://claude.ai/code/session_01XxH9J9TaLYfAYFCaGAqS9y
</commit_message>
<xml_diff>
--- a/papers/thesis_2026-10/reading/thesis_editing_copy_2026-10-23.docx
+++ b/papers/thesis_2026-10/reading/thesis_editing_copy_2026-10-23.docx
@@ -6737,7 +6737,7 @@
         <w:pStyle w:val="BodyText"/>
       </w:pPr>
       <w:r>
-        <w:t xml:space="preserve">The main test was set up after a first, narrower test, so it is exploratory. The narrower test, set before the wider one, compares the three Indonesian marketplaces with the eight foreign platforms chosen first. It points the same way: the Mann–Whitney test rejects equal moves (p = 0.024). A shuffle of platform labels comes close without passing (p = 0.06), because three platforms give any test little power. In that sample, revenue growth and transaction value growth had a correlation of 0.10 in Indonesia and 0.98 abroad, excluding Sea.</w:t>
+        <w:t xml:space="preserve">The main test was set up after a first, narrower test, so it is exploratory. The narrower test, set before the wider one, compares the three Indonesian marketplaces with the eight foreign platforms chosen first. It points the same way. With one median per platform, the Mann–Whitney test rejects equal moves (p = 0.024). A shuffle of platform labels comes close without passing (p = 0.06), since three platforms give a test little power. In that sample, revenue growth and transaction value growth had a correlation of 0.10 in Indonesia and 0.98 abroad, excluding Sea.</w:t>
       </w:r>
     </w:p>
     <w:p>
@@ -6761,7 +6761,7 @@
         <w:pStyle w:val="BodyText"/>
       </w:pPr>
       <w:r>
-        <w:t xml:space="preserve">The large moves were not simply a mark of young platforms, an exploratory check. The Indonesian and regional platforms made their largest moves one or two years after listing. Foreign platforms, by contrast, did not move their take rates more in their first three years after listing than later (median 0.07 against 0.08, p = 0.24, for the 15 foreign platforms with years in both periods). Nor did foreign platforms in lower-income markets move more in 2022 to 2024: one of seven did, against all four Indonesian and regional platforms with enough years. The repricing was an Indonesian and regional episode of those years.</w:t>
+        <w:t xml:space="preserve">The large moves were not simply a mark of young platforms, an exploratory check. The Indonesian and regional platforms made their largest moves one or two years after listing on the stock market. Foreign platforms, by contrast, did not move their take rates more in their first three years after listing than later (median 0.07 against 0.08, p = 0.24). This comparison uses the 15 foreign platforms with years in both periods. Nor did foreign platforms in lower-income markets move more in 2022 to 2024: one of seven did, against all four Indonesian and regional platforms with enough years. The repricing was an Indonesian and regional episode of those years.</w:t>
       </w:r>
     </w:p>
     <w:p>

</xml_diff>

<commit_message>
Chapter 1: reorder the opening (global stakes first, social-selling scene last)
Researcher's decision in chat: the scene-first opening followed the oral deck,
which suits a speaker; a reader needs orientation first. The first line also
said Indonesia for a global point.

New order of the ten opening paragraphs: global change and who follows it;
global stakes; the 2023 BPS and central-bank clash; Tokopedia; the wedge; the
mechanism; the research gap; Indonesia's data and the 2024 gap; the new rules
and tax; chat and social selling (Tanah Abang, TikTok Shop) closing the
chapter. 1.1 to 1.3 unchanged. No numbers or citations changed.

Cross-references in 5.10 and 6.1 adjusted. README zoom rule and EDIT_HISTORY
updated. Compact, full reading and editing copies rebuilt.

Co-Authored-By: Claude Sonnet 5.5 <noreply@anthropic.com>
Claude-Session: https://claude.ai/code/session_01Me3bP2buCLB6LXXcDeTC5v
</commit_message>
<xml_diff>
--- a/papers/thesis_2026-10/reading/thesis_editing_copy_2026-10-23.docx
+++ b/papers/thesis_2026-10/reading/thesis_editing_copy_2026-10-23.docx
@@ -1077,55 +1077,79 @@
         <w:pStyle w:val="FirstParagraph"/>
       </w:pPr>
       <w:r>
-        <w:t xml:space="preserve">Digital commerce has changed how goods and services are bought and sold in Indonesia. Sellers in small towns reach buyers across the country, businesses run from mobile phones, and customers pay by QR code. The figures that measure this activity disagree on both its size and its growth.</w:t>
-      </w:r>
-    </w:p>
-    <w:p>
-      <w:pPr>
-        <w:pStyle w:val="BodyText"/>
-      </w:pPr>
-      <w:r>
-        <w:t xml:space="preserve">In 2023, traders at Tanah Abang, a major wholesale market in Jakarta, said their customers had moved to sellers on TikTok Shop (Agence France-Presse 2023). The government then banned transactions on social media platforms, and TikTok Shop closed in Indonesia soon after (Ministry of Trade of the Republic of Indonesia 2023; Mandagie 2023). That year the national statistics office, BPS, reported that online sales rose by about 41 percent (BPS 2025a). The central bank’s measure of online shopping fell by about 5 percent (Bank Indonesia 2023; KabarBursa 2024). The two official figures moved in opposite directions.</w:t>
-      </w:r>
-    </w:p>
-    <w:p>
-      <w:pPr>
-        <w:pStyle w:val="BodyText"/>
-      </w:pPr>
-      <w:r>
-        <w:t xml:space="preserve">Tokopedia, an Indonesian online marketplace, shows revenue and commerce moving apart inside one company. Between 2022 and 2023, its net revenue rose by 53 percent while the value of transactions on the platform, its transaction value, fell by 9 percent (GoTo Gojek Tokopedia 2024a, 2024b). The two are different amounts. A platform keeps only part of each sale, as commissions and fees. The rest is the seller’s receipts, the driver’s fare or another amount that passes through. This thesis calls the difference the invisible wedge. The term means what a revenue-only measure leaves out. It does not mean activity that goes unrecorded.</w:t>
-      </w:r>
-    </w:p>
-    <w:p>
-      <w:pPr>
-        <w:pStyle w:val="BodyText"/>
-      </w:pPr>
-      <w:r>
-        <w:t xml:space="preserve">The share a platform keeps is not fixed. When it rises, revenue can grow even while transaction value falls. In Tokopedia’s accounts, about 60 percent of the extra revenue came from smaller discounts and incentives, which a platform pays for out of what it earns (GoTo Gojek Tokopedia 2024b).</w:t>
-      </w:r>
-    </w:p>
-    <w:p>
-      <w:pPr>
-        <w:pStyle w:val="BodyText"/>
-      </w:pPr>
-      <w:r>
-        <w:t xml:space="preserve">Platform and online sales figures carry weight well beyond Indonesia. Businesses in 43 economies sold almost US$27 trillion online in 2022, by the United Nations’ estimate (UNCTAD 2024), and platforms carry a growing part of that trade. Investors value the companies that run them largely on reported growth. If part of that growth is a platform keeping more of each sale, then part of the share price rests on a pricing decision. Governments use the same figures to size their digital economies and to tax online sellers.</w:t>
-      </w:r>
-    </w:p>
-    <w:p>
-      <w:pPr>
-        <w:pStyle w:val="BodyText"/>
-      </w:pPr>
-      <w:r>
-        <w:t xml:space="preserve">Research explains why platform revenue and national sales figures can differ, but not when a figure stops moving with the activity it represents, or by how much. Answering that takes two things that are rarely found together. One is a platform’s revenue and transaction value over several years. The other is a national count of online sellers whose underlying answers can be examined.</w:t>
-      </w:r>
-    </w:p>
-    <w:p>
-      <w:pPr>
-        <w:pStyle w:val="BodyText"/>
-      </w:pPr>
-      <w:r>
-        <w:t xml:space="preserve">In Indonesia, several platforms report revenue and transaction value each year, and BPS asks online sellers when they began and how their sales changed. The stakes are concrete. For 2024, BPS gives about US$81 billion for online sales and the central bank about US$31 billion, more than two to one (BPS 2025b; Bank Indonesia 2025). The government has set new rules on platform commissions, discounts and tax. Its tax on marketplace sellers can raise about US$60 million a year on one measure of the market and about US$300 million on another, before exemptions (Ministry of Finance of the Republic of Indonesia 2025; author’s calculation). Most online sellers work through messaging and social media, outside the marketplaces, so platform and survey figures are likely to part. The events of 2023 suggest that they did.</w:t>
+        <w:t xml:space="preserve">Digital commerce has changed how goods and services are bought and sold. A seller in a small town can reach buyers across a country, a business can run from a mobile phone, and a customer can pay by scanning a code. Investors, statistics offices and tax authorities follow this activity through a handful of published figures.</w:t>
+      </w:r>
+    </w:p>
+    <w:p>
+      <w:pPr>
+        <w:pStyle w:val="BodyText"/>
+      </w:pPr>
+      <w:r>
+        <w:t xml:space="preserve">Platform and online sales figures now carry very large sums. Businesses in 43 economies sold almost US$27 trillion online in 2022, by the United Nations’ estimate (UNCTAD 2024), and platforms carry a growing part of that trade. Investors value platforms largely on their reported growth. If part of that growth is a platform keeping more of each sale, part of the share price rests on a pricing decision. Governments use the same figures to size their digital economies and to tax online sellers.</w:t>
+      </w:r>
+    </w:p>
+    <w:p>
+      <w:pPr>
+        <w:pStyle w:val="BodyText"/>
+      </w:pPr>
+      <w:r>
+        <w:t xml:space="preserve">In Indonesia in 2023, two official figures for online commerce moved in opposite directions. The national statistics office, BPS, reported that online sales rose by about 41 percent (BPS 2025a). The central bank’s measure of online shopping fell by about 5 percent (Bank Indonesia 2023; KabarBursa 2024).</w:t>
+      </w:r>
+    </w:p>
+    <w:p>
+      <w:pPr>
+        <w:pStyle w:val="BodyText"/>
+      </w:pPr>
+      <w:r>
+        <w:t xml:space="preserve">Tokopedia, an Indonesian online marketplace, shows revenue and commerce moving apart inside one company. Between 2022 and 2023, its net revenue rose by 53 percent while its transaction value, the value of what was bought through the platform, fell by 9 percent (GoTo Gojek Tokopedia 2024a, 2024b).</w:t>
+      </w:r>
+    </w:p>
+    <w:p>
+      <w:pPr>
+        <w:pStyle w:val="BodyText"/>
+      </w:pPr>
+      <w:r>
+        <w:t xml:space="preserve">Revenue and transaction value differ because a platform keeps only part of each sale, as commissions and fees. The rest is the seller’s receipts, the driver’s fare or another amount that passes through. This thesis calls what a revenue-only measure leaves out the invisible wedge. It does not mean activity that goes unrecorded.</w:t>
+      </w:r>
+    </w:p>
+    <w:p>
+      <w:pPr>
+        <w:pStyle w:val="BodyText"/>
+      </w:pPr>
+      <w:r>
+        <w:t xml:space="preserve">The share a platform keeps is not fixed. When it rises, revenue can grow even as transaction value falls. At Tokopedia, about 60 percent of the extra revenue came from smaller discounts and incentives, which a platform pays out of its own earnings (GoTo Gojek Tokopedia 2024b).</w:t>
+      </w:r>
+    </w:p>
+    <w:p>
+      <w:pPr>
+        <w:pStyle w:val="BodyText"/>
+      </w:pPr>
+      <w:r>
+        <w:t xml:space="preserve">Research explains why platform revenue and national sales figures can differ. It does not say when a figure stops moving with the activity it represents, or by how much. Answering that takes two things rarely found together. One is a platform’s revenue and transaction value over several years. The other is a national count of online sellers whose underlying answers can be examined.</w:t>
+      </w:r>
+    </w:p>
+    <w:p>
+      <w:pPr>
+        <w:pStyle w:val="BodyText"/>
+      </w:pPr>
+      <w:r>
+        <w:t xml:space="preserve">In Indonesia, several platforms report revenue and transaction value each year, and BPS asks online sellers when they began and how their sales changed. For 2024, BPS gives about US$81 billion for online sales and the central bank about US$31 billion, more than two to one (BPS 2025b; Bank Indonesia 2025).</w:t>
+      </w:r>
+    </w:p>
+    <w:p>
+      <w:pPr>
+        <w:pStyle w:val="BodyText"/>
+      </w:pPr>
+      <w:r>
+        <w:t xml:space="preserve">The government has set new rules on platform commissions, discounts and tax. Its tax on marketplace sellers can raise about US$60 million a year on one measure of the market and about US$300 million on another, before exemptions (Ministry of Finance of the Republic of Indonesia 2025; author’s calculation).</w:t>
+      </w:r>
+    </w:p>
+    <w:p>
+      <w:pPr>
+        <w:pStyle w:val="BodyText"/>
+      </w:pPr>
+      <w:r>
+        <w:t xml:space="preserve">Most online sellers work through messaging and social media, outside the marketplaces, so platform and survey figures are likely to part. In 2023, traders at Tanah Abang, a wholesale market in Jakarta, said their customers had moved to sellers on TikTok Shop (Agence France-Presse 2023). The government then banned transactions on social media platforms, and TikTok Shop closed in Indonesia soon after (Ministry of Trade of the Republic of Indonesia 2023; Mandagie 2023). The events of 2023 suggest that the figures did part.</w:t>
       </w:r>
     </w:p>
     <w:bookmarkStart w:id="22" w:name="research-question-and-objectives"/>
@@ -8260,7 +8284,7 @@
         <w:pStyle w:val="FirstParagraph"/>
       </w:pPr>
       <w:r>
-        <w:t xml:space="preserve">The national figures agree that growth was small only where they cover the same sellers, and they do not agree on scale. In 2023, Bank Indonesia’s e-commerce figure fell by about 5 percent while BPS’s rose by about 41 percent. That is the disagreement with which Chapter 1 began, and the third objective asks what lies behind it.</w:t>
+        <w:t xml:space="preserve">The national figures agree that growth was small only where they cover the same sellers, and they do not agree on scale. In 2023, Bank Indonesia’s e-commerce figure fell by about 5 percent while BPS’s rose by about 41 percent. That is the disagreement Chapter 1 introduced, and the third objective asks what lies behind it.</w:t>
       </w:r>
     </w:p>
     <w:p>
@@ -8936,7 +8960,7 @@
         <w:pStyle w:val="BodyText"/>
       </w:pPr>
       <w:r>
-        <w:t xml:space="preserve">Two rules serve as context. The first is the 2023 ban on payments on social media, the step with which Chapter 1 began. Selling through chat and social media remained the norm, and in 2023 about 96 percent of online sellers used them. The second is the small-business tax, which applies in every channel. The survey files cannot identify the content creators it excludes, so the thesis does not measure its reach.</w:t>
+        <w:t xml:space="preserve">Two rules serve as context. The first is the 2023 ban on payments on social media, the step Chapter 1 described. Selling through chat and social media remained the norm, and in 2023 about 96 percent of online sellers used them. The second is the small-business tax, which applies in every channel. The survey files cannot identify the content creators it excludes, so the thesis does not measure its reach.</w:t>
       </w:r>
     </w:p>
     <w:p>

</xml_diff>

<commit_message>
Revert the Chapter 1 global-first reorder; keep it as an alternative
The opening order approved on 12 to 13 Oct (the deck's scene first, then
global stakes, then Indonesia) is restored exactly, with the 5.10 and 6.1
cross-references, the README zoom rule and the three reading copies as they
were. The reordered opening is saved as
papers/thesis_2026-10/alternatives/ch1_opening_global_first_2026-10-23.md
(not read by any build). EDIT_HISTORY has one consolidated entry.

Co-Authored-By: Claude Sonnet 5.5 <noreply@anthropic.com>
Claude-Session: https://claude.ai/code/session_01Me3bP2buCLB6LXXcDeTC5v
</commit_message>
<xml_diff>
--- a/papers/thesis_2026-10/reading/thesis_editing_copy_2026-10-23.docx
+++ b/papers/thesis_2026-10/reading/thesis_editing_copy_2026-10-23.docx
@@ -1077,79 +1077,55 @@
         <w:pStyle w:val="FirstParagraph"/>
       </w:pPr>
       <w:r>
-        <w:t xml:space="preserve">Digital commerce has changed how goods and services are bought and sold. A seller in a small town can reach buyers across a country, a business can run from a mobile phone, and a customer can pay by scanning a code. Investors, statistics offices and tax authorities follow this activity through a handful of published figures.</w:t>
-      </w:r>
-    </w:p>
-    <w:p>
-      <w:pPr>
-        <w:pStyle w:val="BodyText"/>
-      </w:pPr>
-      <w:r>
-        <w:t xml:space="preserve">Platform and online sales figures now carry very large sums. Businesses in 43 economies sold almost US$27 trillion online in 2022, by the United Nations’ estimate (UNCTAD 2024), and platforms carry a growing part of that trade. Investors value platforms largely on their reported growth. If part of that growth is a platform keeping more of each sale, part of the share price rests on a pricing decision. Governments use the same figures to size their digital economies and to tax online sellers.</w:t>
-      </w:r>
-    </w:p>
-    <w:p>
-      <w:pPr>
-        <w:pStyle w:val="BodyText"/>
-      </w:pPr>
-      <w:r>
-        <w:t xml:space="preserve">In Indonesia in 2023, two official figures for online commerce moved in opposite directions. The national statistics office, BPS, reported that online sales rose by about 41 percent (BPS 2025a). The central bank’s measure of online shopping fell by about 5 percent (Bank Indonesia 2023; KabarBursa 2024).</w:t>
-      </w:r>
-    </w:p>
-    <w:p>
-      <w:pPr>
-        <w:pStyle w:val="BodyText"/>
-      </w:pPr>
-      <w:r>
-        <w:t xml:space="preserve">Tokopedia, an Indonesian online marketplace, shows revenue and commerce moving apart inside one company. Between 2022 and 2023, its net revenue rose by 53 percent while its transaction value, the value of what was bought through the platform, fell by 9 percent (GoTo Gojek Tokopedia 2024a, 2024b).</w:t>
-      </w:r>
-    </w:p>
-    <w:p>
-      <w:pPr>
-        <w:pStyle w:val="BodyText"/>
-      </w:pPr>
-      <w:r>
-        <w:t xml:space="preserve">Revenue and transaction value differ because a platform keeps only part of each sale, as commissions and fees. The rest is the seller’s receipts, the driver’s fare or another amount that passes through. This thesis calls what a revenue-only measure leaves out the invisible wedge. It does not mean activity that goes unrecorded.</w:t>
-      </w:r>
-    </w:p>
-    <w:p>
-      <w:pPr>
-        <w:pStyle w:val="BodyText"/>
-      </w:pPr>
-      <w:r>
-        <w:t xml:space="preserve">The share a platform keeps is not fixed. When it rises, revenue can grow even as transaction value falls. At Tokopedia, about 60 percent of the extra revenue came from smaller discounts and incentives, which a platform pays out of its own earnings (GoTo Gojek Tokopedia 2024b).</w:t>
-      </w:r>
-    </w:p>
-    <w:p>
-      <w:pPr>
-        <w:pStyle w:val="BodyText"/>
-      </w:pPr>
-      <w:r>
-        <w:t xml:space="preserve">Research explains why platform revenue and national sales figures can differ. It does not say when a figure stops moving with the activity it represents, or by how much. Answering that takes two things rarely found together. One is a platform’s revenue and transaction value over several years. The other is a national count of online sellers whose underlying answers can be examined.</w:t>
-      </w:r>
-    </w:p>
-    <w:p>
-      <w:pPr>
-        <w:pStyle w:val="BodyText"/>
-      </w:pPr>
-      <w:r>
-        <w:t xml:space="preserve">In Indonesia, several platforms report revenue and transaction value each year, and BPS asks online sellers when they began and how their sales changed. For 2024, BPS gives about US$81 billion for online sales and the central bank about US$31 billion, more than two to one (BPS 2025b; Bank Indonesia 2025).</w:t>
-      </w:r>
-    </w:p>
-    <w:p>
-      <w:pPr>
-        <w:pStyle w:val="BodyText"/>
-      </w:pPr>
-      <w:r>
-        <w:t xml:space="preserve">The government has set new rules on platform commissions, discounts and tax. Its tax on marketplace sellers can raise about US$60 million a year on one measure of the market and about US$300 million on another, before exemptions (Ministry of Finance of the Republic of Indonesia 2025; author’s calculation).</w:t>
-      </w:r>
-    </w:p>
-    <w:p>
-      <w:pPr>
-        <w:pStyle w:val="BodyText"/>
-      </w:pPr>
-      <w:r>
-        <w:t xml:space="preserve">Most online sellers work through messaging and social media, outside the marketplaces, so platform and survey figures are likely to part. In 2023, traders at Tanah Abang, a wholesale market in Jakarta, said their customers had moved to sellers on TikTok Shop (Agence France-Presse 2023). The government then banned transactions on social media platforms, and TikTok Shop closed in Indonesia soon after (Ministry of Trade of the Republic of Indonesia 2023; Mandagie 2023). The events of 2023 suggest that the figures did part.</w:t>
+        <w:t xml:space="preserve">Digital commerce has changed how goods and services are bought and sold in Indonesia. Sellers in small towns reach buyers across the country, businesses run from mobile phones, and customers pay by QR code. The figures that measure this activity disagree on both its size and its growth.</w:t>
+      </w:r>
+    </w:p>
+    <w:p>
+      <w:pPr>
+        <w:pStyle w:val="BodyText"/>
+      </w:pPr>
+      <w:r>
+        <w:t xml:space="preserve">In 2023, traders at Tanah Abang, a major wholesale market in Jakarta, said their customers had moved to sellers on TikTok Shop (Agence France-Presse 2023). The government then banned transactions on social media platforms, and TikTok Shop closed in Indonesia soon after (Ministry of Trade of the Republic of Indonesia 2023; Mandagie 2023). That year the national statistics office, BPS, reported that online sales rose by about 41 percent (BPS 2025a). The central bank’s measure of online shopping fell by about 5 percent (Bank Indonesia 2023; KabarBursa 2024). The two official figures moved in opposite directions.</w:t>
+      </w:r>
+    </w:p>
+    <w:p>
+      <w:pPr>
+        <w:pStyle w:val="BodyText"/>
+      </w:pPr>
+      <w:r>
+        <w:t xml:space="preserve">Tokopedia, an Indonesian online marketplace, shows revenue and commerce moving apart inside one company. Between 2022 and 2023, its net revenue rose by 53 percent while the value of transactions on the platform, its transaction value, fell by 9 percent (GoTo Gojek Tokopedia 2024a, 2024b). The two are different amounts. A platform keeps only part of each sale, as commissions and fees. The rest is the seller’s receipts, the driver’s fare or another amount that passes through. This thesis calls the difference the invisible wedge. The term means what a revenue-only measure leaves out. It does not mean activity that goes unrecorded.</w:t>
+      </w:r>
+    </w:p>
+    <w:p>
+      <w:pPr>
+        <w:pStyle w:val="BodyText"/>
+      </w:pPr>
+      <w:r>
+        <w:t xml:space="preserve">The share a platform keeps is not fixed. When it rises, revenue can grow even while transaction value falls. In Tokopedia’s accounts, about 60 percent of the extra revenue came from smaller discounts and incentives, which a platform pays for out of what it earns (GoTo Gojek Tokopedia 2024b).</w:t>
+      </w:r>
+    </w:p>
+    <w:p>
+      <w:pPr>
+        <w:pStyle w:val="BodyText"/>
+      </w:pPr>
+      <w:r>
+        <w:t xml:space="preserve">Platform and online sales figures carry weight well beyond Indonesia. Businesses in 43 economies sold almost US$27 trillion online in 2022, by the United Nations’ estimate (UNCTAD 2024), and platforms carry a growing part of that trade. Investors value the companies that run them largely on reported growth. If part of that growth is a platform keeping more of each sale, then part of the share price rests on a pricing decision. Governments use the same figures to size their digital economies and to tax online sellers.</w:t>
+      </w:r>
+    </w:p>
+    <w:p>
+      <w:pPr>
+        <w:pStyle w:val="BodyText"/>
+      </w:pPr>
+      <w:r>
+        <w:t xml:space="preserve">Research explains why platform revenue and national sales figures can differ, but not when a figure stops moving with the activity it represents, or by how much. Answering that takes two things that are rarely found together. One is a platform’s revenue and transaction value over several years. The other is a national count of online sellers whose underlying answers can be examined.</w:t>
+      </w:r>
+    </w:p>
+    <w:p>
+      <w:pPr>
+        <w:pStyle w:val="BodyText"/>
+      </w:pPr>
+      <w:r>
+        <w:t xml:space="preserve">In Indonesia, several platforms report revenue and transaction value each year, and BPS asks online sellers when they began and how their sales changed. The stakes are concrete. For 2024, BPS gives about US$81 billion for online sales and the central bank about US$31 billion, more than two to one (BPS 2025b; Bank Indonesia 2025). The government has set new rules on platform commissions, discounts and tax. Its tax on marketplace sellers can raise about US$60 million a year on one measure of the market and about US$300 million on another, before exemptions (Ministry of Finance of the Republic of Indonesia 2025; author’s calculation). Most online sellers work through messaging and social media, outside the marketplaces, so platform and survey figures are likely to part. The events of 2023 suggest that they did.</w:t>
       </w:r>
     </w:p>
     <w:bookmarkStart w:id="22" w:name="research-question-and-objectives"/>
@@ -8284,7 +8260,7 @@
         <w:pStyle w:val="FirstParagraph"/>
       </w:pPr>
       <w:r>
-        <w:t xml:space="preserve">The national figures agree that growth was small only where they cover the same sellers, and they do not agree on scale. In 2023, Bank Indonesia’s e-commerce figure fell by about 5 percent while BPS’s rose by about 41 percent. That is the disagreement Chapter 1 introduced, and the third objective asks what lies behind it.</w:t>
+        <w:t xml:space="preserve">The national figures agree that growth was small only where they cover the same sellers, and they do not agree on scale. In 2023, Bank Indonesia’s e-commerce figure fell by about 5 percent while BPS’s rose by about 41 percent. That is the disagreement with which Chapter 1 began, and the third objective asks what lies behind it.</w:t>
       </w:r>
     </w:p>
     <w:p>
@@ -8960,7 +8936,7 @@
         <w:pStyle w:val="BodyText"/>
       </w:pPr>
       <w:r>
-        <w:t xml:space="preserve">Two rules serve as context. The first is the 2023 ban on payments on social media, the step Chapter 1 described. Selling through chat and social media remained the norm, and in 2023 about 96 percent of online sellers used them. The second is the small-business tax, which applies in every channel. The survey files cannot identify the content creators it excludes, so the thesis does not measure its reach.</w:t>
+        <w:t xml:space="preserve">Two rules serve as context. The first is the 2023 ban on payments on social media, the step with which Chapter 1 began. Selling through chat and social media remained the norm, and in 2023 about 96 percent of online sellers used them. The second is the small-business tax, which applies in every channel. The survey files cannot identify the content creators it excludes, so the thesis does not measure its reach.</w:t>
       </w:r>
     </w:p>
     <w:p>

</xml_diff>

<commit_message>
Chapter 1: slower opening paragraph
Two plain sentences before the first statistic; the stand-in sentence
moves to the start of paragraph 2. Numbers and citations unchanged.
Both reading copies rebuilt; first two pages read.

Co-Authored-By: Claude Sonnet 5.5 <noreply@anthropic.com>
Claude-Session: https://claude.ai/code/session_01XxH9J9TaLYfAYFCaGAqS9y
</commit_message>
<xml_diff>
--- a/papers/thesis_2026-10/reading/thesis_editing_copy_2026-10-23.docx
+++ b/papers/thesis_2026-10/reading/thesis_editing_copy_2026-10-23.docx
@@ -1077,15 +1077,15 @@
         <w:pStyle w:val="FirstParagraph"/>
       </w:pPr>
       <w:r>
-        <w:t xml:space="preserve">Digital commerce has changed how goods and services are bought and sold. Businesses in 43 economies sold almost US$27 trillion online in 2022, by the United Nations’ estimate (UNCTAD 2024), and platforms carry a growing part of that trade. Investors value platforms largely on their reported growth. Governments use the same figures to size their digital economies and to tax online sellers. Each treats a figure as a stand-in for the commerce behind it.</w:t>
-      </w:r>
-    </w:p>
-    <w:p>
-      <w:pPr>
-        <w:pStyle w:val="BodyText"/>
-      </w:pPr>
-      <w:r>
-        <w:t xml:space="preserve">A stand-in follows the commerce only while the link between them holds. A platform keeps just part of each sale, as commissions and fees, and the rest is the seller’s receipts, the driver’s fare or another amount that passes through. This thesis calls what a revenue-only measure leaves out the invisible wedge. It does not mean activity that goes unrecorded. The share a platform keeps is not fixed, so revenue can grow even when the commerce it carries falls. National figures face a similar problem, because a survey can reach more, or different, businesses from one year to the next.</w:t>
+        <w:t xml:space="preserve">Digital commerce has changed how goods and services are bought and sold. A growing part of it passes through platforms, such as online marketplaces and ride and delivery apps. Businesses in 43 economies sold almost US$27 trillion online in 2022, by the United Nations’ estimate (UNCTAD 2024). Investors value platforms largely on their reported growth, and governments use the same figures to size their digital economies and to tax online sellers.</w:t>
+      </w:r>
+    </w:p>
+    <w:p>
+      <w:pPr>
+        <w:pStyle w:val="BodyText"/>
+      </w:pPr>
+      <w:r>
+        <w:t xml:space="preserve">Each treats a figure as a stand-in for the commerce behind it, and a stand-in follows the commerce only while the link between them holds. A platform keeps just part of each sale, as commissions and fees, and the rest is the seller’s receipts, the driver’s fare or another amount that passes through. This thesis calls what a revenue-only measure leaves out the invisible wedge. It does not mean activity that goes unrecorded. The share a platform keeps is not fixed, so revenue can grow even when the commerce it carries falls. National figures face a similar problem, because a survey can reach more, or different, businesses from one year to the next.</w:t>
       </w:r>
     </w:p>
     <w:p>

</xml_diff>

<commit_message>
Chapter 1: opening rebuilt on the benchmark funnel
Claim before support, the statistic last in paragraph 1, the mechanism
without numbers or label in paragraph 2, the 2023 puzzle in paragraph 3,
the explanation then the name (invisible wedge) in paragraph 4. Order
unchanged. One new linking sentence. Numbers and citations unchanged.

Co-Authored-By: Claude Sonnet 5.5 <noreply@anthropic.com>
Claude-Session: https://claude.ai/code/session_01XxH9J9TaLYfAYFCaGAqS9y
</commit_message>
<xml_diff>
--- a/papers/thesis_2026-10/reading/thesis_editing_copy_2026-10-23.docx
+++ b/papers/thesis_2026-10/reading/thesis_editing_copy_2026-10-23.docx
@@ -1077,23 +1077,31 @@
         <w:pStyle w:val="FirstParagraph"/>
       </w:pPr>
       <w:r>
-        <w:t xml:space="preserve">Digital commerce has changed how goods and services are bought and sold. A growing part of it passes through platforms, such as online marketplaces and ride and delivery apps. Businesses in 43 economies sold almost US$27 trillion online in 2022, by the United Nations’ estimate (UNCTAD 2024). Investors value platforms largely on their reported growth, and governments use the same figures to size their digital economies and to tax online sellers.</w:t>
-      </w:r>
-    </w:p>
-    <w:p>
-      <w:pPr>
-        <w:pStyle w:val="BodyText"/>
-      </w:pPr>
-      <w:r>
-        <w:t xml:space="preserve">Each treats a figure as a stand-in for the commerce behind it, and a stand-in follows the commerce only while the link between them holds. A platform keeps just part of each sale, as commissions and fees, and the rest is the seller’s receipts, the driver’s fare or another amount that passes through. This thesis calls what a revenue-only measure leaves out the invisible wedge. It does not mean activity that goes unrecorded. The share a platform keeps is not fixed, so revenue can grow even when the commerce it carries falls. National figures face a similar problem, because a survey can reach more, or different, businesses from one year to the next.</w:t>
-      </w:r>
-    </w:p>
-    <w:p>
-      <w:pPr>
-        <w:pStyle w:val="BodyText"/>
-      </w:pPr>
-      <w:r>
-        <w:t xml:space="preserve">In 2023, Indonesia’s figures parted from the commerce they stand for. Tokopedia, an Indonesian online marketplace, saw its net revenue rise by 53 percent. Its transaction value, the value of what was bought through the platform, fell by 9 percent (GoTo Gojek Tokopedia 2024a, 2024b). About 60 percent of the extra revenue came from smaller discounts and incentives, which a platform pays out of its own earnings (GoTo Gojek Tokopedia 2024b). Nationally, the statistics office, BPS, reported that online sales rose by about 41 percent (BPS 2025a), while the central bank’s measure of online shopping fell by about 5 percent (Bank Indonesia 2023; KabarBursa 2024).</w:t>
+        <w:t xml:space="preserve">Digital commerce has changed how goods and services are bought and sold. A growing part of it passes through platforms, such as online marketplaces and ride and delivery apps. Investors value platforms largely on their reported growth, and governments use the same figures to size their digital economies and to tax online sellers. The trade is large: businesses in 43 economies sold almost US$27 trillion online in 2022, by the United Nations’ estimate (UNCTAD 2024).</w:t>
+      </w:r>
+    </w:p>
+    <w:p>
+      <w:pPr>
+        <w:pStyle w:val="BodyText"/>
+      </w:pPr>
+      <w:r>
+        <w:t xml:space="preserve">Investors and governments each treat a figure as a stand-in for the commerce behind it, and a stand-in follows the commerce only while the link between them holds. A platform keeps just part of each sale, as commissions and fees, and the rest is the seller’s receipts, the driver’s fare or another amount that passes through. The share a platform keeps is not fixed, so revenue can grow even when the commerce it carries falls. National figures face a similar problem, because a survey can reach more, or different, businesses from one year to the next.</w:t>
+      </w:r>
+    </w:p>
+    <w:p>
+      <w:pPr>
+        <w:pStyle w:val="BodyText"/>
+      </w:pPr>
+      <w:r>
+        <w:t xml:space="preserve">In 2023, Indonesia’s figures moved away from the commerce they stand for. Tokopedia, an Indonesian online marketplace, saw its net revenue rise by 53 percent. Its transaction value, the value of what was bought through the platform, fell by 9 percent (GoTo Gojek Tokopedia 2024a, 2024b). Nationally, the statistics office, BPS, reported that online sales rose by about 41 percent (BPS 2025a), while the central bank’s measure of online shopping fell by about 5 percent (Bank Indonesia 2023; KabarBursa 2024).</w:t>
+      </w:r>
+    </w:p>
+    <w:p>
+      <w:pPr>
+        <w:pStyle w:val="BodyText"/>
+      </w:pPr>
+      <w:r>
+        <w:t xml:space="preserve">At Tokopedia, about 60 percent of the extra revenue came from smaller discounts and incentives, which a platform pays out of its own earnings (GoTo Gojek Tokopedia 2024b). So the share the platform kept had changed, not only the commerce. This thesis calls what a revenue-only measure leaves out the invisible wedge. It does not mean activity that goes unrecorded.</w:t>
       </w:r>
     </w:p>
     <w:p>
@@ -1117,7 +1125,7 @@
         <w:pStyle w:val="BodyText"/>
       </w:pPr>
       <w:r>
-        <w:t xml:space="preserve">Most online sellers work through messaging and social media, outside the marketplaces, so platform and survey figures are likely to part. In 2023, traders at Tanah Abang, a wholesale market in Jakarta, said their customers had moved to sellers on TikTok Shop (Agence France-Presse 2023). The government then banned transactions on social media platforms, and TikTok Shop closed in Indonesia soon after (Ministry of Trade of the Republic of Indonesia 2023; Mandagie 2023). The events of 2023 suggest that the figures did part.</w:t>
+        <w:t xml:space="preserve">Most online sellers work through messaging and social media, outside the marketplaces, so platform and survey figures are likely to disagree. In 2023, traders at Tanah Abang, a wholesale market in Jakarta, said their customers had moved to sellers on TikTok Shop (Agence France-Presse 2023). The government then banned transactions on social media platforms, and TikTok Shop closed in Indonesia soon after (Ministry of Trade of the Republic of Indonesia 2023; Mandagie 2023). The events of 2023 suggest that they did.</w:t>
       </w:r>
     </w:p>
     <w:bookmarkStart w:id="22" w:name="research-question-and-objectives"/>

</xml_diff>

<commit_message>
Readability pass on Chapters 2 to 4 and Section 5.2, on the benchmark model
Paragraph-by-paragraph edits approved in chat: splits, groupings and cuts of
repeated literature. Chapter 4 opening no longer says Sea completes the group
(Table 4.1 puts Sea in the foreign group). 1.1 to 1.3 held: the proposed cut
of the 1.1 ambition paragraph conflicts with a settled item. Numbers, labels
and citations unchanged except the three literature citations cut in 3.6.
Reading copies rebuilt; one row added to EDIT_HISTORY.md.

Co-Authored-By: Claude Sonnet 5.5 <noreply@anthropic.com>
Claude-Session: https://claude.ai/code/session_01XxH9J9TaLYfAYFCaGAqS9y
</commit_message>
<xml_diff>
--- a/papers/thesis_2026-10/reading/thesis_editing_copy_2026-10-23.docx
+++ b/papers/thesis_2026-10/reading/thesis_editing_copy_2026-10-23.docx
@@ -1302,7 +1302,15 @@
         <w:pStyle w:val="BodyText"/>
       </w:pPr>
       <w:r>
-        <w:t xml:space="preserve">Platform economics and accounting explain why the share is small and why it can move, but they leave its actual size and movement to be measured. The pricing models were built to explain how a platform sets its charges, so they predict the direction of a change, not its size in a given market. The accounting studies asked how internet firms around 2000 chose to report revenue, not how far that revenue drifted from the commerce behind it (Bowen, Davis and Rajgopal 2002). Studies of how investors valued those firms, and how analysts forecast their revenue, relied on web traffic as their measure of activity (Trueman, Wong and Zhang 2000, 2001; Rajgopal, Venkatachalam and Kotha 2003). Transaction value also needs care, because each company defines it for itself. A figure of this kind loses information when its definition changes (Givoly, Li, Lourie and Nekrasov 2019). Testing whether revenue stays a fair guide needs the reported revenue and transaction value of the same platforms, over several years and on one definition. The studies reviewed here do not make that comparison, and none covers Indonesian platforms.</w:t>
+        <w:t xml:space="preserve">Platform economics and accounting explain why the share is small and why it can move, but they leave its actual size and movement to be measured. The pricing models were built to explain how a platform sets its charges, so they predict the direction of a change, not its size in a given market. The accounting studies asked how internet firms around 2000 chose to report revenue, not how far that revenue drifted from the commerce behind it (Bowen, Davis and Rajgopal 2002). Studies of how investors valued those firms, and how analysts forecast their revenue, relied on web traffic as their measure of activity (Trueman, Wong and Zhang 2000, 2001; Rajgopal, Venkatachalam and Kotha 2003).</w:t>
+      </w:r>
+    </w:p>
+    <w:p>
+      <w:pPr>
+        <w:pStyle w:val="BodyText"/>
+      </w:pPr>
+      <w:r>
+        <w:t xml:space="preserve">Transaction value also needs care, because each company defines it for itself. A figure of this kind loses information when its definition changes (Givoly, Li, Lourie and Nekrasov 2019). Testing whether revenue stays a fair guide needs the reported revenue and transaction value of the same platforms, over several years and on one definition. The studies reviewed here do not make that comparison, and none covers Indonesian platforms.</w:t>
       </w:r>
     </w:p>
     <w:bookmarkEnd w:id="26"/>
@@ -1328,15 +1336,23 @@
         <w:pStyle w:val="BodyText"/>
       </w:pPr>
       <w:r>
-        <w:t xml:space="preserve">Official statistics address the question in two ways. National accounts separate the sale between a buyer and a seller from the platform’s fee, and they count only the fee as the platform’s output (Ahmad and Schreyer 2016; International Monetary Fund 2018; Organisation for Economic Co-operation and Development [OECD] 2023; European Commission et al. 2025). Research on measurement also offers a method: test a figure against the activity it stands for, as studies of night-time lights do for national income (Henderson, Storeygard and Weil 2012). Growth in online sales can be split in the same spirit, into more sales by existing sellers and more sellers entering. Trade economists split a country’s exports in this way, into more of each good and more kinds of goods (Hummels and Klenow 2005).</w:t>
-      </w:r>
-    </w:p>
-    <w:p>
-      <w:pPr>
-        <w:pStyle w:val="BodyText"/>
-      </w:pPr>
-      <w:r>
-        <w:t xml:space="preserve">Official statistics and measurement research say what to count and how to check one figure against another. Neither follows platform figures and national figures through time in one country. National accounting guidance defines the platform’s output, and it does not track how platform commerce and national online sales grow. The test of one figure against another has been applied to national income and night-time lights. Among the studies reviewed here, it has not been applied to platform commerce and national online sales.</w:t>
+        <w:t xml:space="preserve">National accounts separate the sale between a buyer and a seller from the platform’s fee, and they count only the fee as the platform’s output (Ahmad and Schreyer 2016; International Monetary Fund 2018; Organisation for Economic Co-operation and Development [OECD] 2023; European Commission et al. 2025).</w:t>
+      </w:r>
+    </w:p>
+    <w:p>
+      <w:pPr>
+        <w:pStyle w:val="BodyText"/>
+      </w:pPr>
+      <w:r>
+        <w:t xml:space="preserve">Research on measurement offers a method: test a figure against the activity it stands for, as studies of night-time lights do for national income (Henderson, Storeygard and Weil 2012). Growth in online sales can be split in the same spirit, into more sales by existing sellers and more sellers entering. Trade economists split a country’s exports in this way, into more of each good and more kinds of goods (Hummels and Klenow 2005).</w:t>
+      </w:r>
+    </w:p>
+    <w:p>
+      <w:pPr>
+        <w:pStyle w:val="BodyText"/>
+      </w:pPr>
+      <w:r>
+        <w:t xml:space="preserve">Official statistics and measurement research say what to count and how to check one figure against another. Neither follows platform figures and national figures through time in one country. The test of one figure against another has been applied to national income and night-time lights. Among the studies reviewed here, it has not been applied to platform commerce and national online sales.</w:t>
       </w:r>
     </w:p>
     <w:p>
@@ -3384,7 +3400,7 @@
         <w:pStyle w:val="BodyText"/>
       </w:pPr>
       <w:r>
-        <w:t xml:space="preserve">The market-value analysis asks whether investors, who price revenue (Section 2.1), treat its two sources alike. Equation (5) shows that revenue can grow in two ways, through more commerce or through a larger take rate. Early studies of internet companies found that markets priced measures of web activity beyond reported earnings (Trueman, Wong and Zhang 2000; Rajgopal, Venkatachalam and Kotha 2003).</w:t>
+        <w:t xml:space="preserve">The market-value analysis asks whether investors, who price revenue (Section 2.1), treat its two sources alike. Equation (5) shows that revenue can grow in two ways, through more commerce or through a larger take rate.</w:t>
       </w:r>
     </w:p>
     <w:p>
@@ -3427,15 +3443,7 @@
         <w:pStyle w:val="BodyText"/>
       </w:pPr>
       <w:r>
-        <w:t xml:space="preserve">The channel analysis answers the third question of Section 2.4. A rule built on platform records reaches only the sellers whose sales pass through a platform. Research on tax shows that reports from a third party improve compliance where they exist (Kleven et al. 2011).</w:t>
-      </w:r>
-    </w:p>
-    <w:p>
-      <w:pPr>
-        <w:pStyle w:val="BodyText"/>
-      </w:pPr>
-      <w:r>
-        <w:t xml:space="preserve">The reach of a rule built on platform records depends on how online selling divides between marketplaces and channels that no marketplace records, such as messaging apps and social media. The thesis measures that division by sellers and by sales value. It also counts the marketplace sellers who may be large enough to fall under the marketplace tax.</w:t>
+        <w:t xml:space="preserve">The channel analysis answers the third question of Section 2.4. A rule built on platform records reaches only the sellers whose sales pass through a platform. Its reach depends on how online selling divides between marketplaces and channels that no marketplace records, such as messaging apps and social media. The thesis measures that division by sellers and by sales value. It also counts the marketplace sellers who may be large enough to fall under the marketplace tax.</w:t>
       </w:r>
     </w:p>
     <w:p>
@@ -3486,7 +3494,7 @@
         <w:pStyle w:val="BodyText"/>
       </w:pPr>
       <w:r>
-        <w:t xml:space="preserve">On the platform side, the thesis reads revenue and transaction value from annual reports, audited statements and earnings releases. The extraction tables keep the source file and the quoted passage beside every value. The Indonesian platforms are three online marketplaces, Tokopedia, Bukalapak and Blibli, and GoTo, the group that runs the Gojek app for rides and deliveries. GoTo also controlled Tokopedia until 2024 and still holds a stake in it. Two regional companies, both based in Singapore, complete the group: Grab, which runs rides and deliveries across Southeast Asia, and Sea, whose marketplace is Shopee. Where a platform does not report Indonesia alone, as with Shopee and Grab, the thesis states what it derives or borrows and labels it.</w:t>
+        <w:t xml:space="preserve">On the platform side, the thesis reads revenue and transaction value from annual reports, audited statements and earnings releases. The extraction tables keep the source file and the quoted passage beside every value. The Indonesian platforms are three online marketplaces, Tokopedia, Bukalapak and Blibli, and GoTo, the group that runs the Gojek app for rides and deliveries. GoTo also controlled Tokopedia until 2024 and still holds a stake in it. Grab, a Singapore company that runs rides and deliveries across Southeast Asia, completes the group. Sea, also based in Singapore, owns the Shopee marketplace and is read with the foreign platforms (Section 4.1). Where a platform does not report Indonesia alone, as with Shopee and Grab, the thesis states what it derives or borrows and labels it.</w:t>
       </w:r>
     </w:p>
     <w:p>
@@ -3510,7 +3518,7 @@
         <w:pStyle w:val="BodyText"/>
       </w:pPr>
       <w:r>
-        <w:t xml:space="preserve">The chapter describes the evidence on each side and the tests that use it. It starts with the platforms: the data, the wedge in Indonesia, the test of H1, the tracing of large moves and market values. It then turns to the survey: H2, the entry test, and the channels and records of sellers. It ends with the comparison of national figures and with how every number is labelled and traced.</w:t>
+        <w:t xml:space="preserve">The chapter describes the evidence on each side and the tests that use it, platforms first (Sections 4.1 to 4.5) and then the survey (Sections 4.6 to 4.8). It ends with the comparison of national figures and with how every number is labelled and traced (Sections 4.9 and 4.10).</w:t>
       </w:r>
     </w:p>
     <w:bookmarkStart w:id="41" w:name="the-platform-data"/>
@@ -4045,7 +4053,7 @@
         <w:pStyle w:val="BodyText"/>
       </w:pPr>
       <w:r>
-        <w:t xml:space="preserve">Appendix B lists the checks on this test. They drop each platform in turn and treat Tokopedia and GoTo as one company. They repeat the test with growth divergence in points as Chapter 3 defines it, and with exact tests. They also drop two platforms at a time, move Sea to the regional group and keep only the first five years after listing. They compare the change in the take rate in percentage points, to see whether a thin take rate explains the result. They narrow the test to the three marketplaces, correlate revenue growth with transaction value growth, and repeat the test with quarterly pairs.</w:t>
+        <w:t xml:space="preserve">Appendix B lists the checks on this test. Some change the sample. They drop each platform in turn, drop two at a time, treat Tokopedia and GoTo as one company, move Sea to the regional group, keep only the first five years after listing, or narrow the test to the three marketplaces. Others change the measure: growth divergence in points as Chapter 3 defines it, exact tests, the change in the take rate in percentage points (to see whether a thin take rate explains the result), and the correlation of revenue growth with transaction value growth. One repeats the test with quarterly pairs.</w:t>
       </w:r>
     </w:p>
     <w:bookmarkEnd w:id="43"/>
@@ -4483,7 +4491,7 @@
         <w:pStyle w:val="BodyText"/>
       </w:pPr>
       <w:r>
-        <w:t xml:space="preserve">Further checks ask where the extra sellers sit. They look across provinces and channels, using rank correlations, and at sellers’ own reports of their sales. They use the sampling error that BPS publishes. They profile who the extra sellers are, with each group’s count in 2023 compared with what its own yearly change in 2020 to 2022 would give. They look at part-year selling and test a scenario of returners.</w:t>
+        <w:t xml:space="preserve">Further checks ask where the extra sellers sit and who they are. They compare provinces and channels using rank correlations, look at sellers’ own reports of their sales, and use the sampling error that BPS publishes. They compare each group’s count in 2023 with what its own yearly change in 2020 to 2022 would give. They also look at part-year selling and test a scenario of returners.</w:t>
       </w:r>
     </w:p>
     <w:p>
@@ -4541,7 +4549,15 @@
         <w:pStyle w:val="BodyText"/>
       </w:pPr>
       <w:r>
-        <w:t xml:space="preserve">A third analysis builds on the first two and is developed in Chapter 6. It counts the marketplace sellers whose revenue is above a bracket line and expresses the count as a share of all online sellers. At the 2022 rate, BPS’s brackets divide at about US$20,000 a year. The marketplace tax exempts individual sellers up to about US$34,000. So the count above BPS’s line is an upper limit on the sellers the tax can reach. Chapter 6 also sets each recent rule against the part of the figures it acts on. The thesis reads each legal text where it is published. It labels each rule by the status of its text: primary text read, announced, or reported in the news only.</w:t>
+        <w:t xml:space="preserve">A third analysis builds on the first two and is developed in Chapter 6. It counts the marketplace sellers whose revenue is above a bracket line and expresses the count as a share of all online sellers. At the 2022 rate, BPS’s brackets divide at about US$20,000 a year. The marketplace tax exempts individual sellers up to about US$34,000. So the count above BPS’s line is an upper limit on the sellers the tax can reach.</w:t>
+      </w:r>
+    </w:p>
+    <w:p>
+      <w:pPr>
+        <w:pStyle w:val="BodyText"/>
+      </w:pPr>
+      <w:r>
+        <w:t xml:space="preserve">Chapter 6 also sets each recent rule against the part of the figures it acts on. The thesis reads each legal text where it is published. It labels each rule by the status of its text: primary text read, announced, or reported in the news only.</w:t>
       </w:r>
     </w:p>
     <w:bookmarkEnd w:id="48"/>
@@ -6729,7 +6745,7 @@
         <w:pStyle w:val="BodyText"/>
       </w:pPr>
       <w:r>
-        <w:t xml:space="preserve">The main test compares the five platforms with 27 abroad, one median per platform. Both methods of Section 4.3 reject equal moves, with p = 0.004 and p = 0.022. Exact versions, which list every possible split of the 32 platforms, give the same answer (p = 0.004 and p = 0.021). No single platform carries the result: dropping any one, or treating Tokopedia and GoTo as one company, keeps p at 0.016 or below. Dropping two can weaken it. Without Blibli and Tokopedia, the two largest movers, p is 0.058 (Appendix B).</w:t>
+        <w:t xml:space="preserve">The main test compares the five platforms with 27 abroad, using one median per platform. Both methods of Section 4.3 reject equal moves (p = 0.004 and 0.022), and exact versions that list every possible split of the 32 platforms agree (p = 0.004 and 0.021). No single platform carries the result: dropping any one, or treating Tokopedia and GoTo as one company, keeps p at 0.016 or below. Dropping the two largest movers, Blibli and Tokopedia, weakens it to p = 0.058 (Appendix B).</w:t>
       </w:r>
     </w:p>
     <w:p>
@@ -6753,7 +6769,7 @@
         <w:pStyle w:val="BodyText"/>
       </w:pPr>
       <w:r>
-        <w:t xml:space="preserve">One check goes the other way. Quarterly pairs do not reject H1 (p = 0.19), contrary to a prediction registered before the test was run. The quarterly Indonesian pairs mostly cover 2023 to 2026, after most of the repricing, while the large moves came between 2022 and 2024. So the rejection of H1 describes that period.</w:t>
+        <w:t xml:space="preserve">Quarterly pairs do not reject H1 (p = 0.19), contrary to a prediction registered before the test was run. Most of the quarterly Indonesian pairs cover 2023 to 2026, after most of the repricing, while the large moves came between 2022 and 2024. So the rejection of H1 describes that period.</w:t>
       </w:r>
     </w:p>
     <w:p>

</xml_diff>

<commit_message>
Chapter 5 readability pass on the benchmark model
Ten edits across 5.1, 5.3, 5.4, 5.5, 5.7, 5.9 and 5.10: five paragraph splits
with no words changed, ratios already in Table 5.2 dropped from the text,
the two heaviest 5.7 paragraphs reworked to state the claim first. 5.2, 5.6
and 5.8 left as they are. Numbers, labels and citations unchanged (script
check). Reading copies rebuilt; one row added to EDIT_HISTORY.md.

Co-Authored-By: Claude Sonnet 5.5 <noreply@anthropic.com>
Claude-Session: https://claude.ai/code/session_01XxH9J9TaLYfAYFCaGAqS9y
</commit_message>
<xml_diff>
--- a/papers/thesis_2026-10/reading/thesis_editing_copy_2026-10-23.docx
+++ b/papers/thesis_2026-10/reading/thesis_editing_copy_2026-10-23.docx
@@ -6283,15 +6283,15 @@
         <w:pStyle w:val="BodyText"/>
       </w:pPr>
       <w:r>
-        <w:t xml:space="preserve">The three ratios differ because the amounts come from different sources. Tokopedia reports both amounts, and its ratio is about 39. Shopee’s ratio of 9 follows from the assumed take rate, and Grab’s ratio of about 8 is its company-wide ratio, so neither is separate evidence for Indonesia. Blibli and Bukalapak also report both amounts, with ratios of about 43 and 36, close to Tokopedia’s. They stay out of the sum because Blibli’s figure includes online travel and Bukalapak reports for its whole group.</w:t>
-      </w:r>
-    </w:p>
-    <w:p>
-      <w:pPr>
-        <w:pStyle w:val="BodyText"/>
-      </w:pPr>
-      <w:r>
-        <w:t xml:space="preserve">The size of the wedge does not depend on the assumed rates. A take rate for Shopee between 9 and 11 percent keeps the total near US$40 billion. Dropping any one platform still leaves more than US$20 billion. For platforms that report both amounts, the wedge was 97 to 99 percent of transaction value in every year. It moved almost one for one with the commerce, and Appendix A gives the wedge by platform and year.</w:t>
+        <w:t xml:space="preserve">The three ratios differ because the amounts come from different sources. Tokopedia reports both amounts. Shopee’s ratio follows from the assumed take rate, and Grab’s is its company-wide ratio, so neither is separate evidence for Indonesia. Blibli and Bukalapak also report both amounts, with ratios of about 43 and 36, close to Tokopedia’s. They stay out of the sum because Blibli’s figure includes online travel and Bukalapak reports for its whole group.</w:t>
+      </w:r>
+    </w:p>
+    <w:p>
+      <w:pPr>
+        <w:pStyle w:val="BodyText"/>
+      </w:pPr>
+      <w:r>
+        <w:t xml:space="preserve">The size of the wedge does not depend on the assumed rates: a take rate for Shopee between 9 and 11 percent keeps the total near US$40 billion, and dropping any one platform still leaves more than US$20 billion. For platforms that report both amounts, the wedge was 97 to 99 percent of transaction value in every year. It moved almost one for one with the commerce, and Appendix A gives the wedge by platform and year.</w:t>
       </w:r>
     </w:p>
     <w:p>
@@ -7436,7 +7436,15 @@
         <w:pStyle w:val="BodyText"/>
       </w:pPr>
       <w:r>
-        <w:t xml:space="preserve">Higher fees and lower incentives together outweighed more commerce in every window. Lower incentives were the larger of the two in four windows and higher fees in two. In the seventh, Grab from 2021 to 2024, the two were nearly equal. Three series need a note. GoTo’s 2022 transaction value is an estimate. Blibli does not report incentives, so its split rests on a proxy, and part of its 2022–23 rise comes from travel and digital products. Bukalapak’s reports do not allow the parts to be separated.</w:t>
+        <w:t xml:space="preserve">Higher fees and lower incentives together outweighed more commerce in every window. Lower incentives were the larger of the two in four windows and higher fees in two. In the seventh, Grab from 2021 to 2024, the two were nearly equal.</w:t>
+      </w:r>
+    </w:p>
+    <w:p>
+      <w:pPr>
+        <w:pStyle w:val="BodyText"/>
+      </w:pPr>
+      <w:r>
+        <w:t xml:space="preserve">Three series need a note. GoTo’s 2022 transaction value is an estimate. Blibli does not report incentives, so its split rests on a proxy, and part of its 2022–23 rise comes from travel and digital products. Bukalapak’s reports do not allow the parts to be separated.</w:t>
       </w:r>
     </w:p>
     <w:p>
@@ -7559,7 +7567,15 @@
         <w:pStyle w:val="BodyText"/>
       </w:pPr>
       <w:r>
-        <w:t xml:space="preserve">Market value follows the commerce a platform carries. Early studies found a similar link, with markets pricing measures of web activity beyond earnings (Trueman, Wong and Zhang 2000; Rajgopal, Venkatachalam and Kotha 2003). Here the measure of activity is transaction value, which the platforms report themselves. How a firm records revenue matters too. After the 2000 crash, revenue explained less of the prices of internet firms that booked the full sale amount as revenue (Davis 2002). The data do not show that markets valued growth from pricing any less. The national figures give a separate view of the same commerce.</w:t>
+        <w:t xml:space="preserve">Market value follows the commerce a platform carries. Early studies found a similar link, with markets pricing measures of web activity beyond earnings (Trueman, Wong and Zhang 2000; Rajgopal, Venkatachalam and Kotha 2003). Here the measure of activity is transaction value, which the platforms report themselves.</w:t>
+      </w:r>
+    </w:p>
+    <w:p>
+      <w:pPr>
+        <w:pStyle w:val="BodyText"/>
+      </w:pPr>
+      <w:r>
+        <w:t xml:space="preserve">How a firm records revenue matters too. After the 2000 crash, revenue explained less of the prices of internet firms that booked the full sale amount as revenue (Davis 2002). The data do not show that markets valued growth from pricing any less. The national figures give a separate view of the same commerce.</w:t>
       </w:r>
     </w:p>
     <w:bookmarkEnd w:id="61"/>
@@ -7666,7 +7682,15 @@
         <w:pStyle w:val="BodyText"/>
       </w:pPr>
       <w:r>
-        <w:t xml:space="preserve">Fewer sellers reported a rise than a year earlier. About a quarter reported a rise and about a third a fall. A year before, more than a third had reported a rise and a quarter a fall. The mean change was about −4 percent. Lack of demand became the main obstacle, named by 41 percent of sellers against 35 percent in 2022. The published count of online sellers nonetheless rose by 27 percent in 2023. A rise of that size, in a year without a boom in sales, needs explaining.</w:t>
+        <w:t xml:space="preserve">Fewer sellers reported a rise than a year earlier. About a quarter reported a rise and about a third a fall. A year before, more than a third had reported a rise and a quarter a fall. The mean change was about −4 percent. Lack of demand became the main obstacle, named by 41 percent of sellers against 35 percent in 2022.</w:t>
+      </w:r>
+    </w:p>
+    <w:p>
+      <w:pPr>
+        <w:pStyle w:val="BodyText"/>
+      </w:pPr>
+      <w:r>
+        <w:t xml:space="preserve">The published count of online sellers nonetheless rose by 27 percent in 2023. A rise of that size, in a year without a boom in sales, needs explaining.</w:t>
       </w:r>
     </w:p>
     <w:bookmarkEnd w:id="65"/>
@@ -7948,7 +7972,7 @@
         <w:pStyle w:val="BodyText"/>
       </w:pPr>
       <w:r>
-        <w:t xml:space="preserve">The break was uneven. Across the 34 provinces, growth in the count had almost no link to the share of new sellers (a rank correlation of 0.10, on a scale from −1 to 1) and only a weak link to growth in the sample (0.35). The break sat in chat and social selling. Among sellers who began by 2022, those using only chat or social media rose by 13 percent, and marketplace users by 0.3 percent.</w:t>
+        <w:t xml:space="preserve">The break sat in chat and social selling. Among sellers who began by 2022, those using only chat or social media rose by 13 percent, and marketplace users by 0.3 percent. Across the 34 provinces, growth in the count had almost no link to the share of new sellers (a rank correlation of 0.10, on a scale from −1 to 1) and only a weak link to growth in the sample (0.35).</w:t>
       </w:r>
     </w:p>
     <w:p>
@@ -7964,15 +7988,23 @@
         <w:pStyle w:val="BodyText"/>
       </w:pPr>
       <w:r>
-        <w:t xml:space="preserve">Most of the 2023 rise in sales value cannot be traced to what sellers reported. BPS’s figure rose by 41 percent in rupiah, from about US$53 billion to about US$72 billion at each year’s exchange rate. The thesis splits that rise by giving each kind of seller its typical size in the 2022 file. New sellers, sized like those that began in 2022, account for 25 to 30 percent of it. The extra earlier sellers, sized like chat and social sellers, account for 15 to 17 percent. The typical seller already online reported no growth (a mean change of about −4 percent, counting each seller once). That leaves 53 to 59 percent with no source in the sellers’ answers. A few large sellers growing fast could account for it, but the files cannot show whether they did.</w:t>
-      </w:r>
-    </w:p>
-    <w:p>
-      <w:pPr>
-        <w:pStyle w:val="BodyText"/>
-      </w:pPr>
-      <w:r>
-        <w:t xml:space="preserve">The extra count also matters for H2, in an exploratory follow-up. H2’s split treats every seller in the count as having entered. Suppose instead that the sellers not explained by entry were reached by wider coverage, and that their sales came with them. Take both out of the 2023 figures. More businesses then account for about 54 percent of the growth if no seller stopped, and about 42 percent if sellers stopped at 5 percent a year. H2 requires more than 50 percent. So H2 holds on the published series, but it sits right on its threshold once the extra count is read as coverage. Taking out the sellers but keeping their sales gives 34 to 47 percent, but that version treats the count and the value unevenly.</w:t>
+        <w:t xml:space="preserve">Most of the 2023 rise in sales value cannot be traced to what sellers reported. BPS’s figure rose by 41 percent in rupiah, from about US$53 billion to about US$72 billion at each year’s exchange rate. The thesis asks how much of that rise the sellers’ own answers can account for, by giving each kind of seller its typical size in the 2022 file.</w:t>
+      </w:r>
+    </w:p>
+    <w:p>
+      <w:pPr>
+        <w:pStyle w:val="BodyText"/>
+      </w:pPr>
+      <w:r>
+        <w:t xml:space="preserve">New sellers, sized like those that began in 2022, account for 25 to 30 percent of the rise. The extra earlier sellers, sized like chat and social sellers, account for 15 to 17 percent. The typical seller already online reported no growth (a mean change of about −4 percent, counting each seller once). That leaves 53 to 59 percent with no source in the sellers’ answers. A few large sellers growing fast could account for it, but the files cannot show whether they did.</w:t>
+      </w:r>
+    </w:p>
+    <w:p>
+      <w:pPr>
+        <w:pStyle w:val="BodyText"/>
+      </w:pPr>
+      <w:r>
+        <w:t xml:space="preserve">H2 holds on the published series, but it sits right on its threshold once the extra count is read as coverage, an exploratory follow-up. H2’s split treats every seller in the count as having entered. Suppose instead that the sellers not explained by entry were reached by wider coverage, and that their sales came with them. With both taken out of the 2023 figures, more businesses account for about 54 percent of the growth if no seller stopped, and about 42 percent if sellers stopped at 5 percent a year. H2 requires more than 50 percent. Taking out the sellers but keeping their sales gives 34 to 47 percent, but that version treats the count and the value unevenly.</w:t>
       </w:r>
     </w:p>
     <w:p>
@@ -8226,7 +8258,15 @@
         <w:pStyle w:val="BodyText"/>
       </w:pPr>
       <w:r>
-        <w:t xml:space="preserve">Sellers without statements hold far less of the value than of the count. On the bracket scenarios of Section 4.8, they held 26 to 40 percent of online value in 2022, against 79 percent of the count. The validation rule asks the total built from the brackets to lie within half and double BPS’s total. The annual reading passes, just inside the limit at about twice BPS’s total, while the monthly reading gives about 23 times. The lower brackets alone exceed BPS’s total, so the shares are ranges.</w:t>
+        <w:t xml:space="preserve">Sellers without statements hold far less of the value than of the count. On the bracket scenarios of Section 4.8, they held 26 to 40 percent of online value in 2022, against 79 percent of the count.</w:t>
+      </w:r>
+    </w:p>
+    <w:p>
+      <w:pPr>
+        <w:pStyle w:val="BodyText"/>
+      </w:pPr>
+      <w:r>
+        <w:t xml:space="preserve">The validation rule asks the total built from the brackets to lie within half and double BPS’s total. The annual reading passes, just inside the limit at about twice BPS’s total, while the monthly reading gives about 23 times. The lower brackets alone exceed BPS’s total, so the shares are ranges.</w:t>
       </w:r>
     </w:p>
     <w:p>
@@ -8316,7 +8356,15 @@
         <w:pStyle w:val="BodyText"/>
       </w:pPr>
       <w:r>
-        <w:t xml:space="preserve">Levels cannot be reconciled. In 2024, BPS put online sales at about US$81 billion and Bank Indonesia at about US$31 billion. In 2023, BPS’s marketplace slice was about US$13 billion, against about US$38 billion for Tokopedia and the Shopee estimate together. In 2024 it was less than a quarter of Momentum Works’ marketplace estimate of about US$57 billion (Setyowati 2025).</w:t>
+        <w:t xml:space="preserve">Levels cannot be reconciled. In 2024, BPS put online sales at about US$81 billion and Bank Indonesia at about US$31 billion.</w:t>
+      </w:r>
+    </w:p>
+    <w:p>
+      <w:pPr>
+        <w:pStyle w:val="BodyText"/>
+      </w:pPr>
+      <w:r>
+        <w:t xml:space="preserve">In 2023, BPS’s marketplace slice was about US$13 billion, against about US$38 billion for Tokopedia and the Shopee estimate together. In 2024 it was less than a quarter of Momentum Works’ marketplace estimate of about US$57 billion (Setyowati 2025).</w:t>
       </w:r>
     </w:p>
     <w:p>

</xml_diff>

<commit_message>
Chapter 6: two small readability edits
6.2 arithmetic paragraph split in two (no words changed); lead-in
"The players around the cap have different stakes" dropped. Numbers and
citations unchanged (script check). Reading copies rebuilt; log row added.

Co-Authored-By: Claude Sonnet 5.5 <noreply@anthropic.com>
Claude-Session: https://claude.ai/code/session_01XxH9J9TaLYfAYFCaGAqS9y
</commit_message>
<xml_diff>
--- a/papers/thesis_2026-10/reading/thesis_editing_copy_2026-10-23.docx
+++ b/papers/thesis_2026-10/reading/thesis_editing_copy_2026-10-23.docx
@@ -9042,15 +9042,23 @@
         <w:pStyle w:val="BodyText"/>
       </w:pPr>
       <w:r>
-        <w:t xml:space="preserve">The arithmetic of the cap shows how small that slice is. At Grab, the cut from 20 to 8 percent applies to trips worth about 2 percent of on-demand transaction value. If nothing else changes, it lowers the on-demand take rate by at most about a quarter of a point. Grab’s on-demand take rate was about 13 percent in the second quarter of 2026. At GoTo, where two-wheel rides weigh more, the same arithmetic gives at most about 1.4 points on a take rate of about 22 percent. GoTo’s own cost estimate implies about 0.9 points. In both cases the wedge grows by the same amount. The cap moves money from the platform’s revenue to the drivers’ fares, inside the same transaction value.</w:t>
-      </w:r>
-    </w:p>
-    <w:p>
-      <w:pPr>
-        <w:pStyle w:val="BodyText"/>
-      </w:pPr>
-      <w:r>
-        <w:t xml:space="preserve">The players around the cap have different stakes. Drivers asked for it, and the President announced the limit at a May Day rally in 2026, saying the cut</w:t>
+        <w:t xml:space="preserve">The arithmetic of the cap shows how small that slice is. At Grab, the cut from 20 to 8 percent applies to trips worth about 2 percent of on-demand transaction value. If nothing else changes, it lowers the on-demand take rate by at most about a quarter of a point. Grab’s on-demand take rate was about 13 percent in the second quarter of 2026. At GoTo, where two-wheel rides weigh more, the same arithmetic gives at most about 1.4 points on a take rate of about 22 percent. GoTo’s own cost estimate implies about 0.9 points.</w:t>
+      </w:r>
+    </w:p>
+    <w:p>
+      <w:pPr>
+        <w:pStyle w:val="BodyText"/>
+      </w:pPr>
+      <w:r>
+        <w:t xml:space="preserve">In both cases the wedge grows by the same amount. The cap moves money from the platform’s revenue to the drivers’ fares, inside the same transaction value.</w:t>
+      </w:r>
+    </w:p>
+    <w:p>
+      <w:pPr>
+        <w:pStyle w:val="BodyText"/>
+      </w:pPr>
+      <w:r>
+        <w:t xml:space="preserve">Drivers asked for the cap, and the President announced the limit at a May Day rally in 2026, saying the cut</w:t>
       </w:r>
       <w:r>
         <w:t xml:space="preserve"> </w:t>

</xml_diff>

<commit_message>
Chapter 7: seven small readability edits
Market-value sentence moved to the inner-link paragraph, outer-link paragraph
split, two repeated sentences cut from 7.2, two splits in 7.4, step numbering
fixed in 7.5. 7.3 and the 7.4 list untouched (settled). Numbers and
citations unchanged (script check). Reading copies rebuilt; log row added.

Co-Authored-By: Claude Sonnet 5.5 <noreply@anthropic.com>
Claude-Session: https://claude.ai/code/session_01XxH9J9TaLYfAYFCaGAqS9y
</commit_message>
<xml_diff>
--- a/papers/thesis_2026-10/reading/thesis_editing_copy_2026-10-23.docx
+++ b/papers/thesis_2026-10/reading/thesis_editing_copy_2026-10-23.docx
@@ -10064,23 +10064,31 @@
         <w:pStyle w:val="BodyText"/>
       </w:pPr>
       <w:r>
-        <w:t xml:space="preserve">The answer to the second half differs by link. On the inner link, the choice of revenue changed the conclusion, above all from 2022 to 2024. The Indonesian and regional platforms changed their take rates about three times as much as platforms abroad, measured against the take rate itself, so H1 is rejected. They keep a much thinner share of each sale, so price changes of a similar size in points moved their revenue far more. In the windows traced, pricing moved revenue more than commerce did.</w:t>
-      </w:r>
-    </w:p>
-    <w:p>
-      <w:pPr>
-        <w:pStyle w:val="BodyText"/>
-      </w:pPr>
-      <w:r>
-        <w:t xml:space="preserve">On the outer link, H2 holds on BPS’s published figures: more businesses account for most of the growth in online sales value. The registered entry test failed, and about half of the 2023 rise in the count is not explained by first-time entry. The extra count leaned toward long-running businesses. Read as wider coverage, an exploratory check, the extra count leaves H2 on its threshold. With those sellers and their sales taken out, more businesses account for about 42 to 54 percent of the growth, against the 50 percent H2 requires. In the same year, five of six measures of buying through platforms grew more slowly than household spending, and the median seller already online reported no change in sales. Reading BPS’s 2023 figures as a boom in online selling overstates what sellers and platforms reported.</w:t>
-      </w:r>
-    </w:p>
-    <w:p>
-      <w:pPr>
-        <w:pStyle w:val="BodyText"/>
-      </w:pPr>
-      <w:r>
-        <w:t xml:space="preserve">Where the national figures cover the same sellers, they agree on small growth in two of three scenarios. They disagree outside the marketplaces, among the chat and social sellers that only BPS reaches. The figure a reader picks decides whether 2023 looks like a stall or a boom. Market value, for its part, moved with transaction value, and the data do not show that markets valued growth from pricing any less.</w:t>
+        <w:t xml:space="preserve">The answer to the second half differs by link. On the inner link, the choice of revenue changed the conclusion, above all from 2022 to 2024. The Indonesian and regional platforms changed their take rates about three times as much as platforms abroad, measured against the take rate itself, so H1 is rejected. They keep a much thinner share of each sale, so price changes of a similar size in points moved their revenue far more. In the windows traced, pricing moved revenue more than commerce did. Market value, for its part, moved with transaction value, and the data do not show that markets valued growth from pricing any less.</w:t>
+      </w:r>
+    </w:p>
+    <w:p>
+      <w:pPr>
+        <w:pStyle w:val="BodyText"/>
+      </w:pPr>
+      <w:r>
+        <w:t xml:space="preserve">On the outer link, H2 holds on BPS’s published figures: more businesses account for most of the growth in online sales value. The registered entry test failed, and about half of the 2023 rise in the count is not explained by first-time entry. The extra count leaned toward long-running businesses. Read as wider coverage, an exploratory check, the extra count leaves H2 on its threshold: more businesses then account for about 42 to 54 percent of the growth, against the 50 percent H2 requires.</w:t>
+      </w:r>
+    </w:p>
+    <w:p>
+      <w:pPr>
+        <w:pStyle w:val="BodyText"/>
+      </w:pPr>
+      <w:r>
+        <w:t xml:space="preserve">In the same year, five of six measures of buying through platforms grew more slowly than household spending, and the median seller already online reported no change in sales. Reading BPS’s 2023 figures as a boom in online selling overstates what sellers and platforms reported.</w:t>
+      </w:r>
+    </w:p>
+    <w:p>
+      <w:pPr>
+        <w:pStyle w:val="BodyText"/>
+      </w:pPr>
+      <w:r>
+        <w:t xml:space="preserve">Where the national figures cover the same sellers, they agree on small growth in two of three scenarios. They disagree outside the marketplaces, among the chat and social sellers that only BPS reaches. The figure a reader picks decides whether 2023 looks like a stall or a boom.</w:t>
       </w:r>
     </w:p>
     <w:bookmarkEnd w:id="85"/>
@@ -10098,7 +10106,7 @@
         <w:pStyle w:val="FirstParagraph"/>
       </w:pPr>
       <w:r>
-        <w:t xml:space="preserve">For investors, the thesis adds a check that can be run on any platform that reports both amounts. Revenue growth splits into more commerce and a larger take rate with two public figures (equation (5)). At the Indonesian and regional platforms, the take rate accounted for about two thirds of a revenue move at the typical pair. Abroad it accounted for about a quarter. The thinner the take rate, the more a small change in fees or incentives moves revenue growth. The same split shows when market value per dollar of revenue and per dollar of commerce will disagree. Across 28 listed platforms, market value moved with transaction value, as a registered prediction stated. A 1 percent rise in transaction value went with about 0.6 percent more market value. Earlier studies used web traffic as the measure of activity; here it is the transaction value that platforms report themselves.</w:t>
+        <w:t xml:space="preserve">For investors, the thesis adds a check that can be run on any platform that reports both amounts. Revenue growth splits into more commerce and a larger take rate with two public figures (equation (5)). At the Indonesian and regional platforms, the take rate accounted for about two thirds of a revenue move at the typical pair. Abroad it accounted for about a quarter. The thinner the take rate, the more a small change in fees or incentives moves revenue growth. Across 28 listed platforms, market value moved with transaction value, as a registered prediction stated. A 1 percent rise in transaction value went with about 0.6 percent more market value.</w:t>
       </w:r>
     </w:p>
     <w:p>
@@ -10206,15 +10214,31 @@
         <w:pStyle w:val="BodyText"/>
       </w:pPr>
       <w:r>
-        <w:t xml:space="preserve">The platform evidence rests on a small sample. Three Indonesian marketplaces report both revenue and transaction value. The main test of H1 adds the on-demand businesses of Grab and GoTo, which mix rides and deliveries, and Grab’s figures cover the whole region. That test was set up after a narrower first test, so it is exploratory. The tests of H1 are one-sided, because each asks whether the Indonesian and regional group moves more. A two-sided test would about double each p-value, and the main Mann–Whitney result would still be below 1 percent. The result depends on the larger movers. Dropping the two largest, Blibli and Tokopedia, leaves p = 0.058, and keeping only the first five years after each platform’s listing leaves p = 0.059 (Appendix B).</w:t>
-      </w:r>
-    </w:p>
-    <w:p>
-      <w:pPr>
-        <w:pStyle w:val="BodyText"/>
-      </w:pPr>
-      <w:r>
-        <w:t xml:space="preserve">The platform figures carry their own limits. Shopee’s and Grab’s Indonesian amounts come from an outside estimate, an assumed take rate or a company-wide ratio, and they stay out of the main tests. Grab revised some figures between filings. The thesis takes each year from the latest filing that reports it, so one series can mix filings from before and after a revision. Blibli’s incentives are a proxy, and Bukalapak’s reports do not allow the parts of a revenue move to be separated. Company explanations of why revenue moved are reported as statements and are not tested. Foreign platforms also differ in how they book shopper discounts. Eight of the 27 record them mainly as marketing costs, not as lower revenue, which could steady their take rates. Their take rates were not steadier, and without them the test of H1 still gives p = 0.004, an exploratory check (Appendix B).</w:t>
+        <w:t xml:space="preserve">The platform evidence rests on a small sample. Three Indonesian marketplaces report both revenue and transaction value. The main test of H1 adds the on-demand businesses of Grab and GoTo, which mix rides and deliveries, and Grab’s figures cover the whole region. That test was set up after a narrower first test, so it is exploratory.</w:t>
+      </w:r>
+    </w:p>
+    <w:p>
+      <w:pPr>
+        <w:pStyle w:val="BodyText"/>
+      </w:pPr>
+      <w:r>
+        <w:t xml:space="preserve">The tests of H1 are one-sided, because each asks whether the Indonesian and regional group moves more. A two-sided test would about double each p-value, and the main Mann–Whitney result would still be below 1 percent. The result depends on the larger movers. Dropping the two largest, Blibli and Tokopedia, leaves p = 0.058, and keeping only the first five years after each platform’s listing leaves p = 0.059 (Appendix B).</w:t>
+      </w:r>
+    </w:p>
+    <w:p>
+      <w:pPr>
+        <w:pStyle w:val="BodyText"/>
+      </w:pPr>
+      <w:r>
+        <w:t xml:space="preserve">The platform figures carry their own limits. Shopee’s and Grab’s Indonesian amounts come from an outside estimate, an assumed take rate or a company-wide ratio, and they stay out of the main tests. Grab revised some figures between filings. The thesis takes each year from the latest filing that reports it, so one series can mix filings from before and after a revision. Blibli’s incentives are a proxy, and Bukalapak’s reports do not allow the parts of a revenue move to be separated. Company explanations of why revenue moved are reported as statements and are not tested.</w:t>
+      </w:r>
+    </w:p>
+    <w:p>
+      <w:pPr>
+        <w:pStyle w:val="BodyText"/>
+      </w:pPr>
+      <w:r>
+        <w:t xml:space="preserve">Foreign platforms also differ in how they book shopper discounts. Eight of the 27 record them mainly as marketing costs, not as lower revenue, which could steady their take rates. Their take rates were not steadier, and without them the test of H1 still gives p = 0.004, an exploratory check (Appendix B).</w:t>
       </w:r>
     </w:p>
     <w:p>
@@ -10320,7 +10344,7 @@
         <w:pStyle w:val="BodyText"/>
       </w:pPr>
       <w:r>
-        <w:t xml:space="preserve">The platform sample can grow as well: Lazada and TikTok Shop can join the test of H1 once they report Indonesian figures. The last step takes the channel count abroad. Any country whose statistics office asks sellers which channels they use can measure how much online selling its platform rules reach.</w:t>
+        <w:t xml:space="preserve">The fifth step grows the platform sample: Lazada and TikTok Shop can join the test of H1 once they report Indonesian figures. The last step takes the channel count abroad. Any country whose statistics office asks sellers which channels they use can measure how much online selling its platform rules reach.</w:t>
       </w:r>
     </w:p>
     <w:p>

</xml_diff>

<commit_message>
Linear check: revert one Chapter 6 split that broke the opener rule
The 6.2 split left a paragraph opening "In both cases"; rejoined. Linear
check result logged (scripts, handovers, 314 checks all PASS).

Co-Authored-By: Claude Sonnet 5.5 <noreply@anthropic.com>
Claude-Session: https://claude.ai/code/session_01XxH9J9TaLYfAYFCaGAqS9y
</commit_message>
<xml_diff>
--- a/papers/thesis_2026-10/reading/thesis_editing_copy_2026-10-23.docx
+++ b/papers/thesis_2026-10/reading/thesis_editing_copy_2026-10-23.docx
@@ -9042,15 +9042,7 @@
         <w:pStyle w:val="BodyText"/>
       </w:pPr>
       <w:r>
-        <w:t xml:space="preserve">The arithmetic of the cap shows how small that slice is. At Grab, the cut from 20 to 8 percent applies to trips worth about 2 percent of on-demand transaction value. If nothing else changes, it lowers the on-demand take rate by at most about a quarter of a point. Grab’s on-demand take rate was about 13 percent in the second quarter of 2026. At GoTo, where two-wheel rides weigh more, the same arithmetic gives at most about 1.4 points on a take rate of about 22 percent. GoTo’s own cost estimate implies about 0.9 points.</w:t>
-      </w:r>
-    </w:p>
-    <w:p>
-      <w:pPr>
-        <w:pStyle w:val="BodyText"/>
-      </w:pPr>
-      <w:r>
-        <w:t xml:space="preserve">In both cases the wedge grows by the same amount. The cap moves money from the platform’s revenue to the drivers’ fares, inside the same transaction value.</w:t>
+        <w:t xml:space="preserve">The arithmetic of the cap shows how small that slice is. At Grab, the cut from 20 to 8 percent applies to trips worth about 2 percent of on-demand transaction value. If nothing else changes, it lowers the on-demand take rate by at most about a quarter of a point. Grab’s on-demand take rate was about 13 percent in the second quarter of 2026. At GoTo, where two-wheel rides weigh more, the same arithmetic gives at most about 1.4 points on a take rate of about 22 percent. GoTo’s own cost estimate implies about 0.9 points. In both cases the wedge grows by the same amount. The cap moves money from the platform’s revenue to the drivers’ fares, inside the same transaction value.</w:t>
       </w:r>
     </w:p>
     <w:p>

</xml_diff>

<commit_message>
Chapter 1.2 investor and closing paragraphs; 5.2 opener
Cut one abstract sentence from the 1.2 investor paragraph and two repeated
sentences from the 1.2 closing paragraph; 5.2 paragraph 5 no longer opens
on "Both". 1.1 ambition paragraph kept (settled). Numbers and citations
unchanged (script check). Copies rebuilt; log and DECISIONS updated.

Co-Authored-By: Claude Sonnet 5.5 <noreply@anthropic.com>
Claude-Session: https://claude.ai/code/session_01XxH9J9TaLYfAYFCaGAqS9y
</commit_message>
<xml_diff>
--- a/papers/thesis_2026-10/reading/thesis_editing_copy_2026-10-23.docx
+++ b/papers/thesis_2026-10/reading/thesis_editing_copy_2026-10-23.docx
@@ -1200,7 +1200,7 @@
         <w:pStyle w:val="BodyText"/>
       </w:pPr>
       <w:r>
-        <w:t xml:space="preserve">For investors, the thesis shows how small a part of the commerce a platform’s revenue records. That matters for value, because the market values of internet firms track revenue (Bowen, Davis and Rajgopal 2002). It matters for growth as well as size. The larger the wedge is next to revenue, the more a small change in fees or discounts moves revenue growth. When the take rate moves, market value per dollar of revenue and market value per dollar of commerce change by different amounts. The thesis traces why revenue moved, which gives investors a check on whether reported growth came from more commerce or from a larger share of each sale. A prediction registered in advance then tests how market value moves with each.</w:t>
+        <w:t xml:space="preserve">For investors, the thesis shows how small a part of the commerce a platform’s revenue records. That matters for value, because the market values of internet firms track revenue (Bowen, Davis and Rajgopal 2002). It matters for growth too: the larger the wedge is next to revenue, the more a small change in fees or discounts moves revenue growth. The thesis traces why revenue moved, which lets an investor check whether reported growth came from more commerce or from a larger share of each sale. A prediction registered in advance then tests how market value moves with revenue and with commerce.</w:t>
       </w:r>
     </w:p>
     <w:p>
@@ -1224,7 +1224,7 @@
         <w:pStyle w:val="BodyText"/>
       </w:pPr>
       <w:r>
-        <w:t xml:space="preserve">Earlier work has already compared platform transaction values with national e-commerce statistics. This thesis adds connected evidence for one country, drawn from the platforms’ accounts, the sellers’ own survey responses and the rules that act on both. One point recurs across all three. A figure can stop tracking the activity it stands for when the link between them changes, through a platform’s take rate or a survey’s reach.</w:t>
+        <w:t xml:space="preserve">Earlier work has already compared platform transaction values with national e-commerce statistics. This thesis adds connected evidence for one country, drawn from the platforms’ accounts, the sellers’ own survey responses and the rules that act on both.</w:t>
       </w:r>
     </w:p>
     <w:bookmarkEnd w:id="23"/>
@@ -6761,7 +6761,7 @@
         <w:pStyle w:val="BodyText"/>
       </w:pPr>
       <w:r>
-        <w:t xml:space="preserve">Both tests ask about the size of the moves, not their direction, and direction is less telling. Revenue grew faster than transaction value in 13 of the 15 Indonesian and regional pairs, and in two of them the two moved in opposite directions. Abroad, take rates also rose in about two thirds of pairs, but by much less. What sets the Indonesian and regional platforms apart is the size of the moves.</w:t>
+        <w:t xml:space="preserve">The main test and the narrower test ask about the size of the moves, not their direction, and direction is less telling. Revenue grew faster than transaction value in 13 of the 15 Indonesian and regional pairs, and in two of them the two moved in opposite directions. Abroad, take rates also rose in about two thirds of pairs, but by much less. What sets the Indonesian and regional platforms apart is the size of the moves.</w:t>
       </w:r>
     </w:p>
     <w:p>

</xml_diff>

<commit_message>
Chapter 3: four repetition cuts
Recall and young-firm sentences in 3.5 now lean on 2.2; the Hummels and
Klenow sentence in 3.4 and the UNCTAD sentence in 3.6 cut (2.2 gives
both). Every cut citation is still used elsewhere. Chapter 3 is 51 words
shorter. Copies rebuilt; log row added.

Co-Authored-By: Claude Sonnet 5.5 <noreply@anthropic.com>
Claude-Session: https://claude.ai/code/session_01XxH9J9TaLYfAYFCaGAqS9y
</commit_message>
<xml_diff>
--- a/papers/thesis_2026-10/reading/thesis_editing_copy_2026-10-23.docx
+++ b/papers/thesis_2026-10/reading/thesis_editing_copy_2026-10-23.docx
@@ -2993,7 +2993,7 @@
         <w:pStyle w:val="BodyText"/>
       </w:pPr>
       <w:r>
-        <w:t xml:space="preserve">National e-commerce value can grow in two ways. Existing businesses can sell more, which is the intensive margin. More businesses can sell online, which is the extensive margin. Trade economists split a country’s exports in the same way, into more of each good and more kinds of goods (Hummels and Klenow 2005).</w:t>
+        <w:t xml:space="preserve">National e-commerce value can grow in two ways. Existing businesses can sell more, which is the intensive margin. More businesses can sell online, which is the extensive margin.</w:t>
       </w:r>
     </w:p>
     <w:p>
@@ -3140,15 +3140,15 @@
         <w:pStyle w:val="BodyText"/>
       </w:pPr>
       <w:r>
-        <w:t xml:space="preserve">Sellers’ memory works in favour of passing the test. People tend to report past events as more recent than they were (Neter and Waksberg 1964). A seller who began in 2022 but reports 2023 raises the share of new sellers. Recall error of this kind makes the threshold easier to reach, so a share below it is a cautious finding.</w:t>
-      </w:r>
-    </w:p>
-    <w:p>
-      <w:pPr>
-        <w:pStyle w:val="BodyText"/>
-      </w:pPr>
-      <w:r>
-        <w:t xml:space="preserve">If the share of new sellers falls short, part of the rise is something other than first-time entry. Two readings are open. The survey may have reached more of the sellers who were already there. Or sellers may have come back after a pause, since a returning seller keeps an old start year. Small firms that stop are more often young firms with young owners (McKenzie and Paffhausen 2019). So the age of the sellers behind the rise bears on the second reading. Chapter 5 weighs the two readings with that evidence.</w:t>
+        <w:t xml:space="preserve">Sellers’ memory works in favour of passing the test, as Section 2.2 noted: a seller who began in 2022 but reports 2023 raises the share of new sellers. Recall error of this kind makes the threshold easier to reach, so a share below it is a cautious finding.</w:t>
+      </w:r>
+    </w:p>
+    <w:p>
+      <w:pPr>
+        <w:pStyle w:val="BodyText"/>
+      </w:pPr>
+      <w:r>
+        <w:t xml:space="preserve">If the share of new sellers falls short, part of the rise is something other than first-time entry. Two readings are open. The survey may have reached more of the sellers who were already there. Or sellers may have come back after a pause, since a returning seller keeps an old start year. The age of the sellers behind the rise bears on the second reading, because small firms that stop are more often young (Section 2.2). Chapter 5 weighs the two readings with that evidence.</w:t>
       </w:r>
     </w:p>
     <w:bookmarkEnd w:id="38"/>
@@ -3459,7 +3459,7 @@
         <w:pStyle w:val="BodyText"/>
       </w:pPr>
       <w:r>
-        <w:t xml:space="preserve">The comparison of national figures extends the outer link in Figure 3.1. Platform reports, BPS’s survey, Bank Indonesia’s statistics and industry estimates count different things. Their values change with the definition used (UNCTAD 2024).</w:t>
+        <w:t xml:space="preserve">The comparison of national figures extends the outer link in Figure 3.1. Platform reports, BPS’s survey, Bank Indonesia’s statistics and industry estimates count different things.</w:t>
       </w:r>
     </w:p>
     <w:p>

</xml_diff>

<commit_message>
Full reading copy: rebuilt after the 7.5 rewrite, with no notes to the reader
The 60-page PDF predated the 7.5 and 7.3 edits and still carried the draft
notes. build_reading.sh now applies condense.py and a thesis title block;
the editing DOCX keeps the notes as the working file. Records updated,
including the other session's review and its open points.

Co-Authored-By: Claude Sonnet 5.5 <noreply@anthropic.com>
Claude-Session: https://claude.ai/code/session_01XxH9J9TaLYfAYFCaGAqS9y
</commit_message>
<xml_diff>
--- a/papers/thesis_2026-10/reading/thesis_editing_copy_2026-10-23.docx
+++ b/papers/thesis_2026-10/reading/thesis_editing_copy_2026-10-23.docx
@@ -10180,7 +10180,7 @@
         <w:pStyle w:val="BodyText"/>
       </w:pPr>
       <w:r>
-        <w:t xml:space="preserve">Appendix C lists every registered test with its outcome. The predictions on the 2026 rules are scored in Section 6.5. One of them, that the start of the marketplace tax would slip again, was withdrawn, because the tax had started a day before the prediction was registered. A comparison of seven countries on firms’ digital records was withdrawn as a test for a similar reason. Published figures seen at registration already settled it, so it is reported as descriptive.</w:t>
+        <w:t xml:space="preserve">Appendix C lists every registered test with its outcome. The predictions on the 2026 rules are listed in Section 6.5, with the date on which each is scored. One of them, that the start of the marketplace tax would slip again, was withdrawn, because the tax had started a day before the prediction was registered. A comparison of seven countries on firms’ digital records was withdrawn as a test for a similar reason. Published figures seen at registration already settled it, so it is reported as descriptive.</w:t>
       </w:r>
     </w:p>
     <w:bookmarkEnd w:id="87"/>
@@ -10290,13 +10290,13 @@
       </w:r>
     </w:p>
     <w:bookmarkEnd w:id="88"/>
-    <w:bookmarkStart w:id="89" w:name="next-steps"/>
+    <w:bookmarkStart w:id="89" w:name="further-research"/>
     <w:p>
       <w:pPr>
         <w:pStyle w:val="Heading2"/>
       </w:pPr>
       <w:r>
-        <w:t xml:space="preserve">7.5 Next steps</w:t>
+        <w:t xml:space="preserve">7.5 Further research</w:t>
       </w:r>
     </w:p>
     <w:p>
@@ -10304,39 +10304,31 @@
         <w:pStyle w:val="FirstParagraph"/>
       </w:pPr>
       <w:r>
-        <w:t xml:space="preserve">The first step is to score the registered predictions on the 2026 results, as Section 6.5 sets out. The outcomes will show what the companies’ take rates did after the commission cap. Later data will show whether sellers moved away from the four marketplaces that collect the tax.</w:t>
-      </w:r>
-    </w:p>
-    <w:p>
-      <w:pPr>
-        <w:pStyle w:val="BodyText"/>
-      </w:pPr>
-      <w:r>
-        <w:t xml:space="preserve">Reconciling the levels of BPS’s and the platforms’ figures is the second step. It needs common definitions of what counts as a sale, including shipping, digital goods, travel and offline sales. The platform data that BPS now collects could supply the platform side, if BPS publishes them.</w:t>
-      </w:r>
-    </w:p>
-    <w:p>
-      <w:pPr>
-        <w:pStyle w:val="BodyText"/>
-      </w:pPr>
-      <w:r>
-        <w:t xml:space="preserve">The third step concerns the 2026 economic census. When BPS adopts a frame from it, the entry test can be repeated on the first survey that uses the new frame. A business identifier that links survey rounds would settle the question of returning sellers.</w:t>
-      </w:r>
-    </w:p>
-    <w:p>
-      <w:pPr>
-        <w:pStyle w:val="BodyText"/>
-      </w:pPr>
-      <w:r>
-        <w:t xml:space="preserve">The fourth step is a stock-return extension. A test of share prices around results announcements would ask whether investors react differently to growth from commerce and growth from pricing. It needs announcement timing and raw prices that can be reproduced.</w:t>
-      </w:r>
-    </w:p>
-    <w:p>
-      <w:pPr>
-        <w:pStyle w:val="BodyText"/>
-      </w:pPr>
-      <w:r>
-        <w:t xml:space="preserve">The fifth step grows the platform sample: Lazada and TikTok Shop can join the test of H1 once they report Indonesian figures. The last step takes the channel count abroad. Any country whose statistics office asks sellers which channels they use can measure how much online selling its platform rules reach.</w:t>
+        <w:t xml:space="preserve">Five extensions follow from the limits above. The first is to reconcile the levels of BPS’s and the platforms’ figures. It needs common definitions of what counts as a sale, including shipping, digital goods, travel and offline sales. The platform data that BPS now collects could supply the platform side, if BPS publishes them.</w:t>
+      </w:r>
+    </w:p>
+    <w:p>
+      <w:pPr>
+        <w:pStyle w:val="BodyText"/>
+      </w:pPr>
+      <w:r>
+        <w:t xml:space="preserve">The 2026 economic census gives a second. When BPS adopts a frame from it, the entry test can be repeated on the first survey that uses the new frame. A business identifier that links survey rounds would settle the question of returning sellers.</w:t>
+      </w:r>
+    </w:p>
+    <w:p>
+      <w:pPr>
+        <w:pStyle w:val="BodyText"/>
+      </w:pPr>
+      <w:r>
+        <w:t xml:space="preserve">A third is a stock-return extension. A test of share prices around results announcements would ask whether investors react differently to growth from commerce and growth from pricing. It needs announcement timing and raw prices that can be reproduced.</w:t>
+      </w:r>
+    </w:p>
+    <w:p>
+      <w:pPr>
+        <w:pStyle w:val="BodyText"/>
+      </w:pPr>
+      <w:r>
+        <w:t xml:space="preserve">The platform sample can also grow, and the channel count can go abroad. Lazada and TikTok Shop can join the test of H1 once they report Indonesian figures. Any country whose statistics office asks sellers which channels they use can measure how much online selling its platform rules reach.</w:t>
       </w:r>
     </w:p>
     <w:p>

</xml_diff>

<commit_message>
Fonts: page numbers and figures in the body font (Source Serif 4)
Page numbers in both PDFs now use the body font. The six figures are
regenerated from the committed tables in Source Serif 4 (regular, bold,
italic; SIL OFL subset files in figures/fonts), sizes raised about 10
percent; values unchanged. Both reading copies rebuilt. Remaining
exceptions: the Chinese names, appendix file names and Vietnamese
reference letters in the full copy.

Co-Authored-By: Claude Sonnet 5.5 <noreply@anthropic.com>
Claude-Session: https://claude.ai/code/session_01XxH9J9TaLYfAYFCaGAqS9y
</commit_message>
<xml_diff>
--- a/papers/thesis_2026-10/reading/thesis_editing_copy_2026-10-23.docx
+++ b/papers/thesis_2026-10/reading/thesis_editing_copy_2026-10-23.docx
@@ -6803,7 +6803,7 @@
       <w:r>
         <w:drawing>
           <wp:inline>
-            <wp:extent cx="5334000" cy="1965026"/>
+            <wp:extent cx="5334000" cy="1954213"/>
             <wp:effectExtent b="0" l="0" r="0" t="0"/>
             <wp:docPr descr="" title="" id="54" name="Picture"/>
             <a:graphic>
@@ -6824,7 +6824,7 @@
                   <pic:spPr bwMode="auto">
                     <a:xfrm>
                       <a:off x="0" y="0"/>
-                      <a:ext cx="5334000" cy="1965026"/>
+                      <a:ext cx="5334000" cy="1954213"/>
                     </a:xfrm>
                     <a:prstGeom prst="rect">
                       <a:avLst/>
@@ -7462,7 +7462,7 @@
       <w:r>
         <w:drawing>
           <wp:inline>
-            <wp:extent cx="5334000" cy="1805277"/>
+            <wp:extent cx="5334000" cy="1769806"/>
             <wp:effectExtent b="0" l="0" r="0" t="0"/>
             <wp:docPr descr="" title="" id="58" name="Picture"/>
             <a:graphic>
@@ -7483,7 +7483,7 @@
                   <pic:spPr bwMode="auto">
                     <a:xfrm>
                       <a:off x="0" y="0"/>
-                      <a:ext cx="5334000" cy="1805277"/>
+                      <a:ext cx="5334000" cy="1769806"/>
                     </a:xfrm>
                     <a:prstGeom prst="rect">
                       <a:avLst/>
@@ -7619,7 +7619,7 @@
       <w:r>
         <w:drawing>
           <wp:inline>
-            <wp:extent cx="5334000" cy="2862754"/>
+            <wp:extent cx="5334000" cy="2854816"/>
             <wp:effectExtent b="0" l="0" r="0" t="0"/>
             <wp:docPr descr="" title="" id="63" name="Picture"/>
             <a:graphic>
@@ -7640,7 +7640,7 @@
                   <pic:spPr bwMode="auto">
                     <a:xfrm>
                       <a:off x="0" y="0"/>
-                      <a:ext cx="5334000" cy="2862754"/>
+                      <a:ext cx="5334000" cy="2854816"/>
                     </a:xfrm>
                     <a:prstGeom prst="rect">
                       <a:avLst/>
@@ -8040,7 +8040,7 @@
       <w:r>
         <w:drawing>
           <wp:inline>
-            <wp:extent cx="5334000" cy="2117141"/>
+            <wp:extent cx="5334000" cy="2104537"/>
             <wp:effectExtent b="0" l="0" r="0" t="0"/>
             <wp:docPr descr="" title="" id="69" name="Picture"/>
             <a:graphic>
@@ -8061,7 +8061,7 @@
                   <pic:spPr bwMode="auto">
                     <a:xfrm>
                       <a:off x="0" y="0"/>
-                      <a:ext cx="5334000" cy="2117141"/>
+                      <a:ext cx="5334000" cy="2104537"/>
                     </a:xfrm>
                     <a:prstGeom prst="rect">
                       <a:avLst/>
@@ -8187,7 +8187,7 @@
       <w:r>
         <w:drawing>
           <wp:inline>
-            <wp:extent cx="5334000" cy="2553101"/>
+            <wp:extent cx="5334000" cy="2445478"/>
             <wp:effectExtent b="0" l="0" r="0" t="0"/>
             <wp:docPr descr="" title="" id="73" name="Picture"/>
             <a:graphic>
@@ -8208,7 +8208,7 @@
                   <pic:spPr bwMode="auto">
                     <a:xfrm>
                       <a:off x="0" y="0"/>
-                      <a:ext cx="5334000" cy="2553101"/>
+                      <a:ext cx="5334000" cy="2445478"/>
                     </a:xfrm>
                     <a:prstGeom prst="rect">
                       <a:avLst/>

</xml_diff>

<commit_message>
Chapter 6 retitled "Discussion and Policy Implications"
The old title was an unsettled working title that read as a sentence. Heading
and README updated; both reading copies rebuilt (60 and 27 pages); log row
added.

Co-Authored-By: Claude Sonnet 5.5 <noreply@anthropic.com>
Claude-Session: https://claude.ai/code/session_01XxH9J9TaLYfAYFCaGAqS9y
</commit_message>
<xml_diff>
--- a/papers/thesis_2026-10/reading/thesis_editing_copy_2026-10-23.docx
+++ b/papers/thesis_2026-10/reading/thesis_editing_copy_2026-10-23.docx
@@ -8393,13 +8393,13 @@
     </w:p>
     <w:bookmarkEnd w:id="76"/>
     <w:bookmarkEnd w:id="77"/>
-    <w:bookmarkStart w:id="84" w:name="Xf3297f1c0094fd76621fe8d81a0cbffa613ab7d"/>
+    <w:bookmarkStart w:id="84" w:name="Xac9ab56db9ced99e03f55956eafe7ff22a86ddc"/>
     <w:p>
       <w:pPr>
         <w:pStyle w:val="Heading1"/>
       </w:pPr>
       <w:r>
-        <w:t xml:space="preserve">Chapter 6. The Rules and How Far They Reach</w:t>
+        <w:t xml:space="preserve">Chapter 6. Discussion and Policy Implications</w:t>
       </w:r>
     </w:p>
     <w:p>

</xml_diff>

<commit_message>
Abstract shortened to 186 words
Cut from 289 words at the researcher's approval, in answer to Prof. Kong's
comment on abstract length. All numbers and the registered and exploratory
distinction kept. Both reading copies rebuilt; log row added.

Co-Authored-By: Claude Sonnet 5.5 <noreply@anthropic.com>
Claude-Session: https://claude.ai/code/session_01XxH9J9TaLYfAYFCaGAqS9y
</commit_message>
<xml_diff>
--- a/papers/thesis_2026-10/reading/thesis_editing_copy_2026-10-23.docx
+++ b/papers/thesis_2026-10/reading/thesis_editing_copy_2026-10-23.docx
@@ -106,31 +106,23 @@
         <w:pStyle w:val="BodyText"/>
       </w:pPr>
       <w:r>
-        <w:t xml:space="preserve">Figures about the digital economy stand for activity that no one observes directly. A platform’s revenue stands for the commerce it carries, and a survey’s count of sellers stands for the businesses selling online. This thesis asks how much activity remains invisible when platforms are measured through their revenue, and when that choice changes the conclusion about growth. It studies Indonesia, using platform reports, BPS’s survey of online sellers and national figures.</w:t>
-      </w:r>
-    </w:p>
-    <w:p>
-      <w:pPr>
-        <w:pStyle w:val="BodyText"/>
-      </w:pPr>
-      <w:r>
-        <w:t xml:space="preserve">Revenue shows only a small part of the commerce. In 2023, three major platforms in Indonesia kept about US$3 billion of the US$43 billion that passed through them. Revenue also stopped tracking the commerce when platforms changed the share of each sale they kept. Indonesian and regional platforms changed that share about three times as much as 27 platforms abroad. Most of their large changes came between 2022 and 2024. So the hypothesis that revenue grows in proportion to the commerce is rejected.</w:t>
-      </w:r>
-    </w:p>
-    <w:p>
-      <w:pPr>
-        <w:pStyle w:val="BodyText"/>
-      </w:pPr>
-      <w:r>
-        <w:t xml:space="preserve">The national count of online sellers rose by 27 percent in 2023. A test registered before the survey files were opened finds too few new sellers to produce that rise. A later, exploratory count shows that first-time entry explains only about half of it. More businesses account for most of the growth in online sales on the published figures. If the rest of the rise is read as wider survey coverage, that conclusion sits on its threshold.</w:t>
-      </w:r>
-    </w:p>
-    <w:p>
-      <w:pPr>
-        <w:pStyle w:val="BodyText"/>
-      </w:pPr>
-      <w:r>
-        <w:t xml:space="preserve">The two results describe one problem. A figure stops tracking the activity it stands for when the link between them changes, through a platform’s take rate or a survey’s reach. The thesis also measures how far Indonesia’s recent platform rules can reach: the new marketplace tax can collect from at most about 1 in 20 online sellers.</w:t>
+        <w:t xml:space="preserve">A platform’s revenue stands for the commerce it carries, and a survey’s count of sellers stands for the businesses selling online. This thesis asks how much activity remains invisible when platforms are measured through their revenue, and when that choice changes the conclusion about growth. It studies Indonesia, using platform reports, the national statistics office’s survey of online sellers and national figures.</w:t>
+      </w:r>
+    </w:p>
+    <w:p>
+      <w:pPr>
+        <w:pStyle w:val="BodyText"/>
+      </w:pPr>
+      <w:r>
+        <w:t xml:space="preserve">In 2023, three major platforms kept about US$3 billion of the US$43 billion that passed through them. Indonesian and regional platforms changed the share of each sale they kept about three times as much as 27 platforms abroad, mostly between 2022 and 2024, so the hypothesis that revenue grows in proportion to the commerce is rejected.</w:t>
+      </w:r>
+    </w:p>
+    <w:p>
+      <w:pPr>
+        <w:pStyle w:val="BodyText"/>
+      </w:pPr>
+      <w:r>
+        <w:t xml:space="preserve">The count of online sellers rose by 27 percent in 2023. A test registered in advance finds too few new sellers to produce that rise, and first-time entry explains about half of it. If the rest is read as wider survey coverage, the finding that more businesses drive growth sits on its threshold. The new marketplace tax can collect from at most about 1 in 20 online sellers.</w:t>
       </w:r>
     </w:p>
     <w:p>

</xml_diff>

<commit_message>
Whole-paper readability pass: six small edits
Abstract, 1.2 and 5.7 sentences split or simplified; the 5.1 merge undone.
No number, label or citation changed (script check); the 59 bold sentences
still match. Both reading copies rebuilt; log row added.

Co-Authored-By: Claude Sonnet 5.5 <noreply@anthropic.com>
Claude-Session: https://claude.ai/code/session_01XxH9J9TaLYfAYFCaGAqS9y
</commit_message>
<xml_diff>
--- a/papers/thesis_2026-10/reading/thesis_editing_copy_2026-10-23.docx
+++ b/papers/thesis_2026-10/reading/thesis_editing_copy_2026-10-23.docx
@@ -106,15 +106,15 @@
         <w:pStyle w:val="BodyText"/>
       </w:pPr>
       <w:r>
-        <w:t xml:space="preserve">A platform’s revenue stands for the commerce it carries, and a survey’s count of sellers stands for the businesses selling online. This thesis asks how much activity remains invisible when platforms are measured through their revenue, and when that choice changes the conclusion about growth. It studies Indonesia, using platform reports, the national statistics office’s survey of online sellers and national figures.</w:t>
-      </w:r>
-    </w:p>
-    <w:p>
-      <w:pPr>
-        <w:pStyle w:val="BodyText"/>
-      </w:pPr>
-      <w:r>
-        <w:t xml:space="preserve">In 2023, three major platforms kept about US$3 billion of the US$43 billion that passed through them. Indonesian and regional platforms changed the share of each sale they kept about three times as much as 27 platforms abroad, mostly between 2022 and 2024, so the hypothesis that revenue grows in proportion to the commerce is rejected.</w:t>
+        <w:t xml:space="preserve">A platform’s revenue stands for the commerce it carries, and a survey’s count of sellers stands for the businesses selling online. This thesis asks how much activity remains invisible when platforms are measured through their revenue, and when that choice changes the conclusion about growth. It studies Indonesia, using platform reports, a national survey of online sellers and national figures.</w:t>
+      </w:r>
+    </w:p>
+    <w:p>
+      <w:pPr>
+        <w:pStyle w:val="BodyText"/>
+      </w:pPr>
+      <w:r>
+        <w:t xml:space="preserve">In 2023, three major platforms kept about US$3 billion of the US$43 billion that passed through them. Indonesian and regional platforms changed the share of each sale they kept about three times as much as 27 platforms abroad, mostly between 2022 and 2024. So the hypothesis that revenue grows in proportion to the commerce is rejected.</w:t>
       </w:r>
     </w:p>
     <w:p>
@@ -1184,7 +1184,7 @@
         <w:pStyle w:val="FirstParagraph"/>
       </w:pPr>
       <w:r>
-        <w:t xml:space="preserve">The thesis makes three contributions, one for each group that relies on these figures: investors, statistics offices, and the authorities that tax and regulate online selling.</w:t>
+        <w:t xml:space="preserve">The thesis makes three contributions, one for each group that relies on these figures. They are investors, statistics offices, and the authorities that tax and regulate online selling.</w:t>
       </w:r>
     </w:p>
     <w:p>
@@ -1216,7 +1216,7 @@
         <w:pStyle w:val="BodyText"/>
       </w:pPr>
       <w:r>
-        <w:t xml:space="preserve">Earlier work has already compared platform transaction values with national e-commerce statistics. This thesis adds connected evidence for one country, drawn from the platforms’ accounts, the sellers’ own survey responses and the rules that act on both.</w:t>
+        <w:t xml:space="preserve">Earlier work has already compared platform transaction values with national e-commerce statistics. This thesis adds connected evidence for one country. It draws on the platforms’ accounts, the sellers’ own survey responses and the rules that act on both.</w:t>
       </w:r>
     </w:p>
     <w:bookmarkEnd w:id="23"/>
@@ -6283,7 +6283,7 @@
         <w:pStyle w:val="BodyText"/>
       </w:pPr>
       <w:r>
-        <w:t xml:space="preserve">The size of the wedge does not depend on the assumed rates: a take rate for Shopee between 9 and 11 percent keeps the total near US$40 billion, and dropping any one platform still leaves more than US$20 billion. For platforms that report both amounts, the wedge was 97 to 99 percent of transaction value in every year. It moved almost one for one with the commerce, and Appendix A gives the wedge by platform and year.</w:t>
+        <w:t xml:space="preserve">The size of the wedge does not depend on the assumed rates. A take rate for Shopee between 9 and 11 percent keeps the total near US$40 billion, and dropping any one platform still leaves more than US$20 billion. For platforms that report both amounts, the wedge was 97 to 99 percent of transaction value in every year. It moved almost one for one with the commerce, and Appendix A gives the wedge by platform and year.</w:t>
       </w:r>
     </w:p>
     <w:p>
@@ -7964,7 +7964,7 @@
         <w:pStyle w:val="BodyText"/>
       </w:pPr>
       <w:r>
-        <w:t xml:space="preserve">The break sat in chat and social selling. Among sellers who began by 2022, those using only chat or social media rose by 13 percent, and marketplace users by 0.3 percent. Across the 34 provinces, growth in the count had almost no link to the share of new sellers (a rank correlation of 0.10, on a scale from −1 to 1) and only a weak link to growth in the sample (0.35).</w:t>
+        <w:t xml:space="preserve">The break sat in chat and social selling. Among sellers who began by 2022, those using only chat or social media rose by 13 percent, and marketplace users by 0.3 percent. Across the 34 provinces, growth in the count had almost no link to the share of new sellers (a rank correlation of 0.10, on a scale from −1 to 1). It had only a weak link to growth in the sample (0.35).</w:t>
       </w:r>
     </w:p>
     <w:p>

</xml_diff>